<commit_message>
Deploy: pedir la contraseña de sudo al principio y correrlo en primer plano
</commit_message>
<xml_diff>
--- a/docs/Documentacion_TP_Integrador.docx
+++ b/docs/Documentacion_TP_Integrador.docx
@@ -172,14 +172,15 @@
         </w:p>
       </w:sdtContent>
     </w:sdt>
-    <w:bookmarkStart w:id="21" w:name="introducción"/>
     <w:p>
       <w:pPr>
         <w:pStyle w:val="Heading1"/>
       </w:pPr>
+      <w:bookmarkStart w:id="20" w:name="introducción"/>
       <w:r>
         <w:t xml:space="preserve">1. Introducción</w:t>
       </w:r>
+      <w:bookmarkEnd w:id="20"/>
     </w:p>
     <w:p>
       <w:pPr>
@@ -287,21 +288,21 @@
         <w:t xml:space="preserve">balanza y lo que midió el caudalímetro.</w:t>
       </w:r>
     </w:p>
-    <w:bookmarkStart w:id="20" w:name="alcance-actual"/>
     <w:p>
       <w:pPr>
         <w:pStyle w:val="Heading2"/>
       </w:pPr>
+      <w:bookmarkStart w:id="21" w:name="alcance-actual"/>
       <w:r>
         <w:t xml:space="preserve">1.1. Alcance actual</w:t>
       </w:r>
+      <w:bookmarkEnd w:id="21"/>
     </w:p>
     <w:tbl>
       <w:tblPr>
         <w:tblStyle w:val="Table"/>
-        <w:tblW w:type="pct" w:w="5000"/>
-        <w:tblLook w:firstRow="1" w:lastRow="0" w:firstColumn="0" w:lastColumn="0" w:noHBand="0" w:noVBand="0" w:val="0020"/>
-        <w:jc w:val="start"/>
+        <w:tblW w:type="pct" w:w="5000.0"/>
+        <w:tblLook w:firstRow="1"/>
       </w:tblPr>
       <w:tblGrid>
         <w:gridCol w:w="6886"/>
@@ -309,10 +310,15 @@
       </w:tblGrid>
       <w:tr>
         <w:trPr>
-          <w:tblHeader w:val="true"/>
+          <w:cnfStyle w:firstRow="1"/>
         </w:trPr>
         <w:tc>
-          <w:tcPr/>
+          <w:tcPr>
+            <w:tcBorders>
+              <w:bottom w:val="single"/>
+            </w:tcBorders>
+            <w:vAlign w:val="bottom"/>
+          </w:tcPr>
           <w:p>
             <w:pPr>
               <w:pStyle w:val="Compact"/>
@@ -324,7 +330,12 @@
           </w:p>
         </w:tc>
         <w:tc>
-          <w:tcPr/>
+          <w:tcPr>
+            <w:tcBorders>
+              <w:bottom w:val="single"/>
+            </w:tcBorders>
+            <w:vAlign w:val="bottom"/>
+          </w:tcPr>
           <w:p>
             <w:pPr>
               <w:pStyle w:val="Compact"/>
@@ -338,7 +349,6 @@
       </w:tr>
       <w:tr>
         <w:tc>
-          <w:tcPr/>
           <w:p>
             <w:pPr>
               <w:pStyle w:val="Compact"/>
@@ -350,7 +360,6 @@
           </w:p>
         </w:tc>
         <w:tc>
-          <w:tcPr/>
           <w:p>
             <w:pPr>
               <w:pStyle w:val="Compact"/>
@@ -364,7 +373,6 @@
       </w:tr>
       <w:tr>
         <w:tc>
-          <w:tcPr/>
           <w:p>
             <w:pPr>
               <w:pStyle w:val="Compact"/>
@@ -376,7 +384,6 @@
           </w:p>
         </w:tc>
         <w:tc>
-          <w:tcPr/>
           <w:p>
             <w:pPr>
               <w:pStyle w:val="Compact"/>
@@ -390,7 +397,6 @@
       </w:tr>
       <w:tr>
         <w:tc>
-          <w:tcPr/>
           <w:p>
             <w:pPr>
               <w:pStyle w:val="Compact"/>
@@ -402,7 +408,6 @@
           </w:p>
         </w:tc>
         <w:tc>
-          <w:tcPr/>
           <w:p>
             <w:pPr>
               <w:pStyle w:val="Compact"/>
@@ -416,7 +421,6 @@
       </w:tr>
       <w:tr>
         <w:tc>
-          <w:tcPr/>
           <w:p>
             <w:pPr>
               <w:pStyle w:val="Compact"/>
@@ -428,7 +432,6 @@
           </w:p>
         </w:tc>
         <w:tc>
-          <w:tcPr/>
           <w:p>
             <w:pPr>
               <w:pStyle w:val="Compact"/>
@@ -442,7 +445,6 @@
       </w:tr>
       <w:tr>
         <w:tc>
-          <w:tcPr/>
           <w:p>
             <w:pPr>
               <w:pStyle w:val="Compact"/>
@@ -454,7 +456,6 @@
           </w:p>
         </w:tc>
         <w:tc>
-          <w:tcPr/>
           <w:p>
             <w:pPr>
               <w:pStyle w:val="Compact"/>
@@ -468,7 +469,6 @@
       </w:tr>
       <w:tr>
         <w:tc>
-          <w:tcPr/>
           <w:p>
             <w:pPr>
               <w:pStyle w:val="Compact"/>
@@ -480,7 +480,6 @@
           </w:p>
         </w:tc>
         <w:tc>
-          <w:tcPr/>
           <w:p>
             <w:pPr>
               <w:pStyle w:val="Compact"/>
@@ -494,7 +493,6 @@
       </w:tr>
       <w:tr>
         <w:tc>
-          <w:tcPr/>
           <w:p>
             <w:pPr>
               <w:pStyle w:val="Compact"/>
@@ -506,7 +504,6 @@
           </w:p>
         </w:tc>
         <w:tc>
-          <w:tcPr/>
           <w:p>
             <w:pPr>
               <w:pStyle w:val="Compact"/>
@@ -520,7 +517,6 @@
       </w:tr>
       <w:tr>
         <w:tc>
-          <w:tcPr/>
           <w:p>
             <w:pPr>
               <w:pStyle w:val="Compact"/>
@@ -532,7 +528,6 @@
           </w:p>
         </w:tc>
         <w:tc>
-          <w:tcPr/>
           <w:p>
             <w:pPr>
               <w:pStyle w:val="Compact"/>
@@ -546,7 +541,6 @@
       </w:tr>
       <w:tr>
         <w:tc>
-          <w:tcPr/>
           <w:p>
             <w:pPr>
               <w:pStyle w:val="Compact"/>
@@ -558,7 +552,6 @@
           </w:p>
         </w:tc>
         <w:tc>
-          <w:tcPr/>
           <w:p>
             <w:pPr>
               <w:pStyle w:val="Compact"/>
@@ -571,25 +564,25 @@
         </w:tc>
       </w:tr>
     </w:tbl>
-    <w:bookmarkEnd w:id="20"/>
-    <w:bookmarkEnd w:id="21"/>
-    <w:bookmarkStart w:id="25" w:name="tecnologías-y-organización"/>
     <w:p>
       <w:pPr>
         <w:pStyle w:val="Heading1"/>
       </w:pPr>
+      <w:bookmarkStart w:id="22" w:name="tecnologías-y-organización"/>
       <w:r>
         <w:t xml:space="preserve">2. Tecnologías y organización</w:t>
       </w:r>
-    </w:p>
-    <w:bookmarkStart w:id="22" w:name="tecnologías"/>
+      <w:bookmarkEnd w:id="22"/>
+    </w:p>
     <w:p>
       <w:pPr>
         <w:pStyle w:val="Heading2"/>
       </w:pPr>
+      <w:bookmarkStart w:id="23" w:name="tecnologías"/>
       <w:r>
         <w:t xml:space="preserve">2.1. Tecnologías</w:t>
       </w:r>
+      <w:bookmarkEnd w:id="23"/>
     </w:p>
     <w:p>
       <w:pPr>
@@ -601,7 +594,6 @@
       </w:pPr>
       <w:r>
         <w:rPr>
-          <w:bCs/>
           <w:b/>
         </w:rPr>
         <w:t xml:space="preserve">Java 21</w:t>
@@ -617,7 +609,6 @@
       </w:r>
       <w:r>
         <w:rPr>
-          <w:bCs/>
           <w:b/>
         </w:rPr>
         <w:t xml:space="preserve">Spring Boot 4</w:t>
@@ -639,7 +630,6 @@
       </w:pPr>
       <w:r>
         <w:rPr>
-          <w:bCs/>
           <w:b/>
         </w:rPr>
         <w:t xml:space="preserve">Spring Data JPA / Hibernate</w:t>
@@ -655,7 +645,6 @@
       </w:r>
       <w:r>
         <w:rPr>
-          <w:bCs/>
           <w:b/>
         </w:rPr>
         <w:t xml:space="preserve">MySQL 8</w:t>
@@ -689,7 +678,6 @@
       </w:pPr>
       <w:r>
         <w:rPr>
-          <w:bCs/>
           <w:b/>
         </w:rPr>
         <w:t xml:space="preserve">Spring Security</w:t>
@@ -705,7 +693,6 @@
       </w:r>
       <w:r>
         <w:rPr>
-          <w:bCs/>
           <w:b/>
         </w:rPr>
         <w:t xml:space="preserve">JWT</w:t>
@@ -727,7 +714,6 @@
       </w:pPr>
       <w:r>
         <w:rPr>
-          <w:bCs/>
           <w:b/>
         </w:rPr>
         <w:t xml:space="preserve">Lombok</w:t>
@@ -749,7 +735,6 @@
       </w:pPr>
       <w:r>
         <w:rPr>
-          <w:bCs/>
           <w:b/>
         </w:rPr>
         <w:t xml:space="preserve">springdoc-openapi</w:t>
@@ -771,7 +756,6 @@
       </w:pPr>
       <w:r>
         <w:rPr>
-          <w:bCs/>
           <w:b/>
         </w:rPr>
         <w:t xml:space="preserve">Postman</w:t>
@@ -814,7 +798,6 @@
       </w:r>
       <w:r>
         <w:rPr>
-          <w:bCs/>
           <w:b/>
         </w:rPr>
         <w:t xml:space="preserve">Tomcat</w:t>
@@ -830,7 +813,6 @@
       </w:r>
       <w:r>
         <w:rPr>
-          <w:bCs/>
           <w:b/>
         </w:rPr>
         <w:t xml:space="preserve">nginx</w:t>
@@ -848,15 +830,15 @@
         <w:t xml:space="preserve">HTTPS (infraestructura armada en el práctico anterior).</w:t>
       </w:r>
     </w:p>
-    <w:bookmarkEnd w:id="22"/>
-    <w:bookmarkStart w:id="23" w:name="capas"/>
     <w:p>
       <w:pPr>
         <w:pStyle w:val="Heading2"/>
       </w:pPr>
+      <w:bookmarkStart w:id="24" w:name="capas"/>
       <w:r>
         <w:t xml:space="preserve">2.2. Capas</w:t>
       </w:r>
+      <w:bookmarkEnd w:id="24"/>
     </w:p>
     <w:p>
       <w:pPr>
@@ -869,9 +851,8 @@
     <w:tbl>
       <w:tblPr>
         <w:tblStyle w:val="Table"/>
-        <w:tblW w:type="pct" w:w="5000"/>
-        <w:tblLook w:firstRow="1" w:lastRow="0" w:firstColumn="0" w:lastColumn="0" w:noHBand="0" w:noVBand="0" w:val="0020"/>
-        <w:jc w:val="start"/>
+        <w:tblW w:type="pct" w:w="5000.0"/>
+        <w:tblLook w:firstRow="1"/>
       </w:tblPr>
       <w:tblGrid>
         <w:gridCol w:w="1044"/>
@@ -880,10 +861,15 @@
       </w:tblGrid>
       <w:tr>
         <w:trPr>
-          <w:tblHeader w:val="true"/>
+          <w:cnfStyle w:firstRow="1"/>
         </w:trPr>
         <w:tc>
-          <w:tcPr/>
+          <w:tcPr>
+            <w:tcBorders>
+              <w:bottom w:val="single"/>
+            </w:tcBorders>
+            <w:vAlign w:val="bottom"/>
+          </w:tcPr>
           <w:p>
             <w:pPr>
               <w:pStyle w:val="Compact"/>
@@ -895,7 +881,12 @@
           </w:p>
         </w:tc>
         <w:tc>
-          <w:tcPr/>
+          <w:tcPr>
+            <w:tcBorders>
+              <w:bottom w:val="single"/>
+            </w:tcBorders>
+            <w:vAlign w:val="bottom"/>
+          </w:tcPr>
           <w:p>
             <w:pPr>
               <w:pStyle w:val="Compact"/>
@@ -907,7 +898,12 @@
           </w:p>
         </w:tc>
         <w:tc>
-          <w:tcPr/>
+          <w:tcPr>
+            <w:tcBorders>
+              <w:bottom w:val="single"/>
+            </w:tcBorders>
+            <w:vAlign w:val="bottom"/>
+          </w:tcPr>
           <w:p>
             <w:pPr>
               <w:pStyle w:val="Compact"/>
@@ -921,7 +917,6 @@
       </w:tr>
       <w:tr>
         <w:tc>
-          <w:tcPr/>
           <w:p>
             <w:pPr>
               <w:pStyle w:val="Compact"/>
@@ -933,7 +928,6 @@
           </w:p>
         </w:tc>
         <w:tc>
-          <w:tcPr/>
           <w:p>
             <w:pPr>
               <w:pStyle w:val="Compact"/>
@@ -948,7 +942,6 @@
           </w:p>
         </w:tc>
         <w:tc>
-          <w:tcPr/>
           <w:p>
             <w:pPr>
               <w:pStyle w:val="Compact"/>
@@ -962,7 +955,6 @@
       </w:tr>
       <w:tr>
         <w:tc>
-          <w:tcPr/>
           <w:p>
             <w:pPr>
               <w:pStyle w:val="Compact"/>
@@ -974,7 +966,6 @@
           </w:p>
         </w:tc>
         <w:tc>
-          <w:tcPr/>
           <w:p>
             <w:pPr>
               <w:pStyle w:val="Compact"/>
@@ -989,7 +980,6 @@
           </w:p>
         </w:tc>
         <w:tc>
-          <w:tcPr/>
           <w:p>
             <w:pPr>
               <w:pStyle w:val="Compact"/>
@@ -1021,7 +1011,6 @@
       </w:tr>
       <w:tr>
         <w:tc>
-          <w:tcPr/>
           <w:p>
             <w:pPr>
               <w:pStyle w:val="Compact"/>
@@ -1033,7 +1022,6 @@
           </w:p>
         </w:tc>
         <w:tc>
-          <w:tcPr/>
           <w:p>
             <w:pPr>
               <w:pStyle w:val="Compact"/>
@@ -1048,7 +1036,6 @@
           </w:p>
         </w:tc>
         <w:tc>
-          <w:tcPr/>
           <w:p>
             <w:pPr>
               <w:pStyle w:val="Compact"/>
@@ -1062,7 +1049,6 @@
       </w:tr>
       <w:tr>
         <w:tc>
-          <w:tcPr/>
           <w:p>
             <w:pPr>
               <w:pStyle w:val="Compact"/>
@@ -1074,7 +1060,6 @@
           </w:p>
         </w:tc>
         <w:tc>
-          <w:tcPr/>
           <w:p>
             <w:pPr>
               <w:pStyle w:val="Compact"/>
@@ -1089,7 +1074,6 @@
           </w:p>
         </w:tc>
         <w:tc>
-          <w:tcPr/>
           <w:p>
             <w:pPr>
               <w:pStyle w:val="Compact"/>
@@ -1103,7 +1087,6 @@
       </w:tr>
       <w:tr>
         <w:tc>
-          <w:tcPr/>
           <w:p>
             <w:pPr>
               <w:pStyle w:val="Compact"/>
@@ -1115,7 +1098,6 @@
           </w:p>
         </w:tc>
         <w:tc>
-          <w:tcPr/>
           <w:p>
             <w:pPr>
               <w:pStyle w:val="Compact"/>
@@ -1130,7 +1112,6 @@
           </w:p>
         </w:tc>
         <w:tc>
-          <w:tcPr/>
           <w:p>
             <w:pPr>
               <w:pStyle w:val="Compact"/>
@@ -1155,7 +1136,6 @@
       </w:r>
       <w:r>
         <w:rPr>
-          <w:bCs/>
           <w:b/>
         </w:rPr>
         <w:t xml:space="preserve">controlador → negocio → repositorio → base de datos</w:t>
@@ -1170,33 +1150,34 @@
         <w:t xml:space="preserve">vuelve por el mismo camino.</w:t>
       </w:r>
     </w:p>
-    <w:bookmarkEnd w:id="23"/>
-    <w:bookmarkStart w:id="24" w:name="carpetas-del-repositorio"/>
     <w:p>
       <w:pPr>
         <w:pStyle w:val="Heading2"/>
       </w:pPr>
+      <w:bookmarkStart w:id="25" w:name="carpetas-del-repositorio"/>
       <w:r>
         <w:t xml:space="preserve">2.3. Carpetas del repositorio</w:t>
       </w:r>
+      <w:bookmarkEnd w:id="25"/>
     </w:p>
     <w:tbl>
       <w:tblPr>
         <w:tblStyle w:val="Table"/>
-        <w:tblW w:type="pct" w:w="5000"/>
-        <w:tblLook w:firstRow="1" w:lastRow="0" w:firstColumn="0" w:lastColumn="0" w:noHBand="0" w:noVBand="0" w:val="0020"/>
-        <w:jc w:val="start"/>
+        <w:tblW w:type="pct" w:w="0.0"/>
+        <w:tblLook w:firstRow="1"/>
       </w:tblPr>
-      <w:tblGrid>
-        <w:gridCol w:w="2534"/>
-        <w:gridCol w:w="5385"/>
-      </w:tblGrid>
+      <w:tblGrid/>
       <w:tr>
         <w:trPr>
-          <w:tblHeader w:val="true"/>
+          <w:cnfStyle w:firstRow="1"/>
         </w:trPr>
         <w:tc>
-          <w:tcPr/>
+          <w:tcPr>
+            <w:tcBorders>
+              <w:bottom w:val="single"/>
+            </w:tcBorders>
+            <w:vAlign w:val="bottom"/>
+          </w:tcPr>
           <w:p>
             <w:pPr>
               <w:pStyle w:val="Compact"/>
@@ -1208,7 +1189,12 @@
           </w:p>
         </w:tc>
         <w:tc>
-          <w:tcPr/>
+          <w:tcPr>
+            <w:tcBorders>
+              <w:bottom w:val="single"/>
+            </w:tcBorders>
+            <w:vAlign w:val="bottom"/>
+          </w:tcPr>
           <w:p>
             <w:pPr>
               <w:pStyle w:val="Compact"/>
@@ -1222,7 +1208,6 @@
       </w:tr>
       <w:tr>
         <w:tc>
-          <w:tcPr/>
           <w:p>
             <w:pPr>
               <w:pStyle w:val="Compact"/>
@@ -1237,7 +1222,6 @@
           </w:p>
         </w:tc>
         <w:tc>
-          <w:tcPr/>
           <w:p>
             <w:pPr>
               <w:pStyle w:val="Compact"/>
@@ -1251,7 +1235,6 @@
       </w:tr>
       <w:tr>
         <w:tc>
-          <w:tcPr/>
           <w:p>
             <w:pPr>
               <w:pStyle w:val="Compact"/>
@@ -1266,7 +1249,6 @@
           </w:p>
         </w:tc>
         <w:tc>
-          <w:tcPr/>
           <w:p>
             <w:pPr>
               <w:pStyle w:val="Compact"/>
@@ -1280,7 +1262,6 @@
       </w:tr>
       <w:tr>
         <w:tc>
-          <w:tcPr/>
           <w:p>
             <w:pPr>
               <w:pStyle w:val="Compact"/>
@@ -1295,7 +1276,6 @@
           </w:p>
         </w:tc>
         <w:tc>
-          <w:tcPr/>
           <w:p>
             <w:pPr>
               <w:pStyle w:val="Compact"/>
@@ -1309,7 +1289,6 @@
       </w:tr>
       <w:tr>
         <w:tc>
-          <w:tcPr/>
           <w:p>
             <w:pPr>
               <w:pStyle w:val="Compact"/>
@@ -1324,7 +1303,6 @@
           </w:p>
         </w:tc>
         <w:tc>
-          <w:tcPr/>
           <w:p>
             <w:pPr>
               <w:pStyle w:val="Compact"/>
@@ -1338,7 +1316,6 @@
       </w:tr>
       <w:tr>
         <w:tc>
-          <w:tcPr/>
           <w:p>
             <w:pPr>
               <w:pStyle w:val="Compact"/>
@@ -1365,7 +1342,6 @@
           </w:p>
         </w:tc>
         <w:tc>
-          <w:tcPr/>
           <w:p>
             <w:pPr>
               <w:pStyle w:val="Compact"/>
@@ -1378,16 +1354,15 @@
         </w:tc>
       </w:tr>
     </w:tbl>
-    <w:bookmarkEnd w:id="24"/>
-    <w:bookmarkEnd w:id="25"/>
-    <w:bookmarkStart w:id="26" w:name="punto-de-partida"/>
     <w:p>
       <w:pPr>
         <w:pStyle w:val="Heading1"/>
       </w:pPr>
+      <w:bookmarkStart w:id="26" w:name="punto-de-partida"/>
       <w:r>
         <w:t xml:space="preserve">3. Punto de partida</w:t>
       </w:r>
+      <w:bookmarkEnd w:id="26"/>
     </w:p>
     <w:p>
       <w:pPr>
@@ -1430,9 +1405,8 @@
     <w:tbl>
       <w:tblPr>
         <w:tblStyle w:val="Table"/>
-        <w:tblW w:type="pct" w:w="5000"/>
-        <w:tblLook w:firstRow="1" w:lastRow="0" w:firstColumn="0" w:lastColumn="0" w:noHBand="0" w:noVBand="0" w:val="0020"/>
-        <w:jc w:val="start"/>
+        <w:tblW w:type="pct" w:w="5000.0"/>
+        <w:tblLook w:firstRow="1"/>
       </w:tblPr>
       <w:tblGrid>
         <w:gridCol w:w="3960"/>
@@ -1440,10 +1414,15 @@
       </w:tblGrid>
       <w:tr>
         <w:trPr>
-          <w:tblHeader w:val="true"/>
+          <w:cnfStyle w:firstRow="1"/>
         </w:trPr>
         <w:tc>
-          <w:tcPr/>
+          <w:tcPr>
+            <w:tcBorders>
+              <w:bottom w:val="single"/>
+            </w:tcBorders>
+            <w:vAlign w:val="bottom"/>
+          </w:tcPr>
           <w:p>
             <w:pPr>
               <w:pStyle w:val="Compact"/>
@@ -1455,7 +1434,12 @@
           </w:p>
         </w:tc>
         <w:tc>
-          <w:tcPr/>
+          <w:tcPr>
+            <w:tcBorders>
+              <w:bottom w:val="single"/>
+            </w:tcBorders>
+            <w:vAlign w:val="bottom"/>
+          </w:tcPr>
           <w:p>
             <w:pPr>
               <w:pStyle w:val="Compact"/>
@@ -1469,7 +1453,6 @@
       </w:tr>
       <w:tr>
         <w:tc>
-          <w:tcPr/>
           <w:p>
             <w:pPr>
               <w:pStyle w:val="Compact"/>
@@ -1532,7 +1515,6 @@
           </w:p>
         </w:tc>
         <w:tc>
-          <w:tcPr/>
           <w:p>
             <w:pPr>
               <w:pStyle w:val="Compact"/>
@@ -1570,7 +1552,6 @@
       </w:tr>
       <w:tr>
         <w:tc>
-          <w:tcPr/>
           <w:p>
             <w:pPr>
               <w:pStyle w:val="Compact"/>
@@ -1591,7 +1572,6 @@
           </w:p>
         </w:tc>
         <w:tc>
-          <w:tcPr/>
           <w:p>
             <w:pPr>
               <w:pStyle w:val="Compact"/>
@@ -1605,7 +1585,6 @@
       </w:tr>
       <w:tr>
         <w:tc>
-          <w:tcPr/>
           <w:p>
             <w:pPr>
               <w:pStyle w:val="Compact"/>
@@ -1638,7 +1617,6 @@
           </w:p>
         </w:tc>
         <w:tc>
-          <w:tcPr/>
           <w:p>
             <w:pPr>
               <w:pStyle w:val="Compact"/>
@@ -1652,7 +1630,6 @@
       </w:tr>
       <w:tr>
         <w:tc>
-          <w:tcPr/>
           <w:p>
             <w:pPr>
               <w:pStyle w:val="Compact"/>
@@ -1685,7 +1662,6 @@
           </w:p>
         </w:tc>
         <w:tc>
-          <w:tcPr/>
           <w:p>
             <w:pPr>
               <w:pStyle w:val="Compact"/>
@@ -1799,24 +1775,25 @@
         <w:t xml:space="preserve">).</w:t>
       </w:r>
     </w:p>
-    <w:bookmarkEnd w:id="26"/>
-    <w:bookmarkStart w:id="32" w:name="modelo-de-datos"/>
     <w:p>
       <w:pPr>
         <w:pStyle w:val="Heading1"/>
       </w:pPr>
+      <w:bookmarkStart w:id="27" w:name="modelo-de-datos"/>
       <w:r>
         <w:t xml:space="preserve">4. Modelo de datos</w:t>
       </w:r>
-    </w:p>
-    <w:bookmarkStart w:id="27" w:name="entidades-que-vienen-de-sap"/>
+      <w:bookmarkEnd w:id="27"/>
+    </w:p>
     <w:p>
       <w:pPr>
         <w:pStyle w:val="Heading2"/>
       </w:pPr>
+      <w:bookmarkStart w:id="28" w:name="entidades-que-vienen-de-sap"/>
       <w:r>
         <w:t xml:space="preserve">4.1. Entidades que vienen de SAP</w:t>
       </w:r>
+      <w:bookmarkEnd w:id="28"/>
     </w:p>
     <w:p>
       <w:pPr>
@@ -1846,7 +1823,6 @@
       <w:r>
         <w:rPr>
           <w:rStyle w:val="VerbatimChar"/>
-          <w:bCs/>
           <w:b/>
         </w:rPr>
         <w:t xml:space="preserve">codigoExterno</w:t>
@@ -1882,22 +1858,21 @@
     <w:tbl>
       <w:tblPr>
         <w:tblStyle w:val="Table"/>
-        <w:tblW w:type="pct" w:w="5000"/>
-        <w:tblLook w:firstRow="1" w:lastRow="0" w:firstColumn="0" w:lastColumn="0" w:noHBand="0" w:noVBand="0" w:val="0020"/>
-        <w:jc w:val="start"/>
+        <w:tblW w:type="pct" w:w="0.0"/>
+        <w:tblLook w:firstRow="1"/>
       </w:tblPr>
-      <w:tblGrid>
-        <w:gridCol w:w="900"/>
-        <w:gridCol w:w="990"/>
-        <w:gridCol w:w="4860"/>
-        <w:gridCol w:w="1170"/>
-      </w:tblGrid>
+      <w:tblGrid/>
       <w:tr>
         <w:trPr>
-          <w:tblHeader w:val="true"/>
+          <w:cnfStyle w:firstRow="1"/>
         </w:trPr>
         <w:tc>
-          <w:tcPr/>
+          <w:tcPr>
+            <w:tcBorders>
+              <w:bottom w:val="single"/>
+            </w:tcBorders>
+            <w:vAlign w:val="bottom"/>
+          </w:tcPr>
           <w:p>
             <w:pPr>
               <w:pStyle w:val="Compact"/>
@@ -1909,7 +1884,12 @@
           </w:p>
         </w:tc>
         <w:tc>
-          <w:tcPr/>
+          <w:tcPr>
+            <w:tcBorders>
+              <w:bottom w:val="single"/>
+            </w:tcBorders>
+            <w:vAlign w:val="bottom"/>
+          </w:tcPr>
           <w:p>
             <w:pPr>
               <w:pStyle w:val="Compact"/>
@@ -1921,7 +1901,12 @@
           </w:p>
         </w:tc>
         <w:tc>
-          <w:tcPr/>
+          <w:tcPr>
+            <w:tcBorders>
+              <w:bottom w:val="single"/>
+            </w:tcBorders>
+            <w:vAlign w:val="bottom"/>
+          </w:tcPr>
           <w:p>
             <w:pPr>
               <w:pStyle w:val="Compact"/>
@@ -1933,7 +1918,12 @@
           </w:p>
         </w:tc>
         <w:tc>
-          <w:tcPr/>
+          <w:tcPr>
+            <w:tcBorders>
+              <w:bottom w:val="single"/>
+            </w:tcBorders>
+            <w:vAlign w:val="bottom"/>
+          </w:tcPr>
           <w:p>
             <w:pPr>
               <w:pStyle w:val="Compact"/>
@@ -1947,7 +1937,6 @@
       </w:tr>
       <w:tr>
         <w:tc>
-          <w:tcPr/>
           <w:p>
             <w:pPr>
               <w:pStyle w:val="Compact"/>
@@ -1962,7 +1951,6 @@
           </w:p>
         </w:tc>
         <w:tc>
-          <w:tcPr/>
           <w:p>
             <w:pPr>
               <w:pStyle w:val="Compact"/>
@@ -1977,7 +1965,6 @@
           </w:p>
         </w:tc>
         <w:tc>
-          <w:tcPr/>
           <w:p>
             <w:pPr>
               <w:pStyle w:val="Compact"/>
@@ -2028,7 +2015,6 @@
           </w:p>
         </w:tc>
         <w:tc>
-          <w:tcPr/>
           <w:p>
             <w:pPr>
               <w:pStyle w:val="Compact"/>
@@ -2045,7 +2031,6 @@
       </w:tr>
       <w:tr>
         <w:tc>
-          <w:tcPr/>
           <w:p>
             <w:pPr>
               <w:pStyle w:val="Compact"/>
@@ -2060,7 +2045,6 @@
           </w:p>
         </w:tc>
         <w:tc>
-          <w:tcPr/>
           <w:p>
             <w:pPr>
               <w:pStyle w:val="Compact"/>
@@ -2075,7 +2059,6 @@
           </w:p>
         </w:tc>
         <w:tc>
-          <w:tcPr/>
           <w:p>
             <w:pPr>
               <w:pStyle w:val="Compact"/>
@@ -2102,7 +2085,6 @@
           </w:p>
         </w:tc>
         <w:tc>
-          <w:tcPr/>
           <w:p>
             <w:pPr>
               <w:pStyle w:val="Compact"/>
@@ -2116,7 +2098,6 @@
       </w:tr>
       <w:tr>
         <w:tc>
-          <w:tcPr/>
           <w:p>
             <w:pPr>
               <w:pStyle w:val="Compact"/>
@@ -2131,7 +2112,6 @@
           </w:p>
         </w:tc>
         <w:tc>
-          <w:tcPr/>
           <w:p>
             <w:pPr>
               <w:pStyle w:val="Compact"/>
@@ -2146,7 +2126,6 @@
           </w:p>
         </w:tc>
         <w:tc>
-          <w:tcPr/>
           <w:p>
             <w:pPr>
               <w:pStyle w:val="Compact"/>
@@ -2197,7 +2176,6 @@
           </w:p>
         </w:tc>
         <w:tc>
-          <w:tcPr/>
           <w:p>
             <w:pPr>
               <w:pStyle w:val="Compact"/>
@@ -2214,7 +2192,6 @@
       </w:tr>
       <w:tr>
         <w:tc>
-          <w:tcPr/>
           <w:p>
             <w:pPr>
               <w:pStyle w:val="Compact"/>
@@ -2229,7 +2206,6 @@
           </w:p>
         </w:tc>
         <w:tc>
-          <w:tcPr/>
           <w:p>
             <w:pPr>
               <w:pStyle w:val="Compact"/>
@@ -2244,7 +2220,6 @@
           </w:p>
         </w:tc>
         <w:tc>
-          <w:tcPr/>
           <w:p>
             <w:pPr>
               <w:pStyle w:val="Compact"/>
@@ -2283,7 +2258,6 @@
           </w:p>
         </w:tc>
         <w:tc>
-          <w:tcPr/>
           <w:p>
             <w:pPr>
               <w:pStyle w:val="Compact"/>
@@ -2300,7 +2274,6 @@
       </w:tr>
       <w:tr>
         <w:tc>
-          <w:tcPr/>
           <w:p>
             <w:pPr>
               <w:pStyle w:val="Compact"/>
@@ -2315,7 +2288,6 @@
           </w:p>
         </w:tc>
         <w:tc>
-          <w:tcPr/>
           <w:p>
             <w:pPr>
               <w:pStyle w:val="Compact"/>
@@ -2330,7 +2302,6 @@
           </w:p>
         </w:tc>
         <w:tc>
-          <w:tcPr/>
           <w:p>
             <w:pPr>
               <w:pStyle w:val="Compact"/>
@@ -2369,7 +2340,6 @@
           </w:p>
         </w:tc>
         <w:tc>
-          <w:tcPr/>
           <w:p>
             <w:pPr>
               <w:pStyle w:val="Compact"/>
@@ -2391,7 +2361,6 @@
       </w:pPr>
       <w:r>
         <w:rPr>
-          <w:bCs/>
           <w:b/>
         </w:rPr>
         <w:t xml:space="preserve">Cisternado.</w:t>
@@ -2480,15 +2449,15 @@
         <w:t xml:space="preserve">cisternas, y si una cisterna se saca de la lista, se borra de la base.</w:t>
       </w:r>
     </w:p>
-    <w:bookmarkEnd w:id="27"/>
-    <w:bookmarkStart w:id="28" w:name="orden"/>
     <w:p>
       <w:pPr>
         <w:pStyle w:val="Heading2"/>
       </w:pPr>
+      <w:bookmarkStart w:id="29" w:name="orden"/>
       <w:r>
         <w:t xml:space="preserve">4.2. Orden</w:t>
       </w:r>
+      <w:bookmarkEnd w:id="29"/>
     </w:p>
     <w:p>
       <w:pPr>
@@ -2522,9 +2491,8 @@
     <w:tbl>
       <w:tblPr>
         <w:tblStyle w:val="Table"/>
-        <w:tblW w:type="pct" w:w="5000"/>
-        <w:tblLook w:firstRow="1" w:lastRow="0" w:firstColumn="0" w:lastColumn="0" w:noHBand="0" w:noVBand="0" w:val="0020"/>
-        <w:jc w:val="start"/>
+        <w:tblW w:type="pct" w:w="5000.0"/>
+        <w:tblLook w:firstRow="1"/>
       </w:tblPr>
       <w:tblGrid>
         <w:gridCol w:w="2457"/>
@@ -2532,10 +2500,15 @@
       </w:tblGrid>
       <w:tr>
         <w:trPr>
-          <w:tblHeader w:val="true"/>
+          <w:cnfStyle w:firstRow="1"/>
         </w:trPr>
         <w:tc>
-          <w:tcPr/>
+          <w:tcPr>
+            <w:tcBorders>
+              <w:bottom w:val="single"/>
+            </w:tcBorders>
+            <w:vAlign w:val="bottom"/>
+          </w:tcPr>
           <w:p>
             <w:pPr>
               <w:pStyle w:val="Compact"/>
@@ -2547,7 +2520,12 @@
           </w:p>
         </w:tc>
         <w:tc>
-          <w:tcPr/>
+          <w:tcPr>
+            <w:tcBorders>
+              <w:bottom w:val="single"/>
+            </w:tcBorders>
+            <w:vAlign w:val="bottom"/>
+          </w:tcPr>
           <w:p>
             <w:pPr>
               <w:pStyle w:val="Compact"/>
@@ -2561,7 +2539,6 @@
       </w:tr>
       <w:tr>
         <w:tc>
-          <w:tcPr/>
           <w:p>
             <w:pPr>
               <w:pStyle w:val="Compact"/>
@@ -2573,7 +2550,6 @@
           </w:p>
         </w:tc>
         <w:tc>
-          <w:tcPr/>
           <w:p>
             <w:pPr>
               <w:pStyle w:val="Compact"/>
@@ -2611,7 +2587,6 @@
       </w:tr>
       <w:tr>
         <w:tc>
-          <w:tcPr/>
           <w:p>
             <w:pPr>
               <w:pStyle w:val="Compact"/>
@@ -2623,7 +2598,6 @@
           </w:p>
         </w:tc>
         <w:tc>
-          <w:tcPr/>
           <w:p>
             <w:pPr>
               <w:pStyle w:val="Compact"/>
@@ -2682,7 +2656,6 @@
       </w:tr>
       <w:tr>
         <w:tc>
-          <w:tcPr/>
           <w:p>
             <w:pPr>
               <w:pStyle w:val="Compact"/>
@@ -2694,7 +2667,6 @@
           </w:p>
         </w:tc>
         <w:tc>
-          <w:tcPr/>
           <w:p>
             <w:pPr>
               <w:pStyle w:val="Compact"/>
@@ -2732,7 +2704,6 @@
       </w:tr>
       <w:tr>
         <w:tc>
-          <w:tcPr/>
           <w:p>
             <w:pPr>
               <w:pStyle w:val="Compact"/>
@@ -2744,7 +2715,6 @@
           </w:p>
         </w:tc>
         <w:tc>
-          <w:tcPr/>
           <w:p>
             <w:pPr>
               <w:pStyle w:val="Compact"/>
@@ -2767,7 +2737,6 @@
       </w:tr>
       <w:tr>
         <w:tc>
-          <w:tcPr/>
           <w:p>
             <w:pPr>
               <w:pStyle w:val="Compact"/>
@@ -2779,7 +2748,6 @@
           </w:p>
         </w:tc>
         <w:tc>
-          <w:tcPr/>
           <w:p>
             <w:pPr>
               <w:pStyle w:val="Compact"/>
@@ -2817,7 +2785,6 @@
       </w:tr>
       <w:tr>
         <w:tc>
-          <w:tcPr/>
           <w:p>
             <w:pPr>
               <w:pStyle w:val="Compact"/>
@@ -2829,7 +2796,6 @@
           </w:p>
         </w:tc>
         <w:tc>
-          <w:tcPr/>
           <w:p>
             <w:pPr>
               <w:pStyle w:val="Compact"/>
@@ -2852,7 +2818,6 @@
       </w:tr>
       <w:tr>
         <w:tc>
-          <w:tcPr/>
           <w:p>
             <w:pPr>
               <w:pStyle w:val="Compact"/>
@@ -2864,7 +2829,6 @@
           </w:p>
         </w:tc>
         <w:tc>
-          <w:tcPr/>
           <w:p>
             <w:pPr>
               <w:pStyle w:val="Compact"/>
@@ -2929,7 +2893,6 @@
       </w:tr>
       <w:tr>
         <w:tc>
-          <w:tcPr/>
           <w:p>
             <w:pPr>
               <w:pStyle w:val="Compact"/>
@@ -2941,7 +2904,6 @@
           </w:p>
         </w:tc>
         <w:tc>
-          <w:tcPr/>
           <w:p>
             <w:pPr>
               <w:pStyle w:val="Compact"/>
@@ -3133,15 +3095,15 @@
         <w:t xml:space="preserve">devuelve el número de estado (1 a 4) para mostrarlo junto al nombre.</w:t>
       </w:r>
     </w:p>
-    <w:bookmarkEnd w:id="28"/>
-    <w:bookmarkStart w:id="29" w:name="detallecarga"/>
     <w:p>
       <w:pPr>
         <w:pStyle w:val="Heading2"/>
       </w:pPr>
+      <w:bookmarkStart w:id="30" w:name="detallecarga"/>
       <w:r>
         <w:t xml:space="preserve">4.3. DetalleCarga</w:t>
       </w:r>
+      <w:bookmarkEnd w:id="30"/>
     </w:p>
     <w:p>
       <w:pPr>
@@ -3285,15 +3247,15 @@
         <w:t xml:space="preserve">cada uno.</w:t>
       </w:r>
     </w:p>
-    <w:bookmarkEnd w:id="29"/>
-    <w:bookmarkStart w:id="30" w:name="cambioestado-auditoría"/>
     <w:p>
       <w:pPr>
         <w:pStyle w:val="Heading2"/>
       </w:pPr>
+      <w:bookmarkStart w:id="31" w:name="cambioestado-auditoría"/>
       <w:r>
         <w:t xml:space="preserve">4.4. CambioEstado (auditoría)</w:t>
       </w:r>
+      <w:bookmarkEnd w:id="31"/>
     </w:p>
     <w:p>
       <w:pPr>
@@ -3390,22 +3352,21 @@
         <w:t xml:space="preserve">).</w:t>
       </w:r>
     </w:p>
-    <w:bookmarkEnd w:id="30"/>
-    <w:bookmarkStart w:id="31" w:name="relaciones"/>
     <w:p>
       <w:pPr>
         <w:pStyle w:val="Heading2"/>
       </w:pPr>
+      <w:bookmarkStart w:id="32" w:name="relaciones"/>
       <w:r>
         <w:t xml:space="preserve">4.5. Relaciones</w:t>
       </w:r>
+      <w:bookmarkEnd w:id="32"/>
     </w:p>
     <w:tbl>
       <w:tblPr>
         <w:tblStyle w:val="Table"/>
-        <w:tblW w:type="pct" w:w="5000"/>
-        <w:tblLook w:firstRow="1" w:lastRow="0" w:firstColumn="0" w:lastColumn="0" w:noHBand="0" w:noVBand="0" w:val="0020"/>
-        <w:jc w:val="start"/>
+        <w:tblW w:type="pct" w:w="5000.0"/>
+        <w:tblLook w:firstRow="1"/>
       </w:tblPr>
       <w:tblGrid>
         <w:gridCol w:w="924"/>
@@ -3415,10 +3376,15 @@
       </w:tblGrid>
       <w:tr>
         <w:trPr>
-          <w:tblHeader w:val="true"/>
+          <w:cnfStyle w:firstRow="1"/>
         </w:trPr>
         <w:tc>
-          <w:tcPr/>
+          <w:tcPr>
+            <w:tcBorders>
+              <w:bottom w:val="single"/>
+            </w:tcBorders>
+            <w:vAlign w:val="bottom"/>
+          </w:tcPr>
           <w:p>
             <w:pPr>
               <w:pStyle w:val="Compact"/>
@@ -3430,7 +3396,12 @@
           </w:p>
         </w:tc>
         <w:tc>
-          <w:tcPr/>
+          <w:tcPr>
+            <w:tcBorders>
+              <w:bottom w:val="single"/>
+            </w:tcBorders>
+            <w:vAlign w:val="bottom"/>
+          </w:tcPr>
           <w:p>
             <w:pPr>
               <w:pStyle w:val="Compact"/>
@@ -3442,7 +3413,12 @@
           </w:p>
         </w:tc>
         <w:tc>
-          <w:tcPr/>
+          <w:tcPr>
+            <w:tcBorders>
+              <w:bottom w:val="single"/>
+            </w:tcBorders>
+            <w:vAlign w:val="bottom"/>
+          </w:tcPr>
           <w:p>
             <w:pPr>
               <w:pStyle w:val="Compact"/>
@@ -3454,7 +3430,12 @@
           </w:p>
         </w:tc>
         <w:tc>
-          <w:tcPr/>
+          <w:tcPr>
+            <w:tcBorders>
+              <w:bottom w:val="single"/>
+            </w:tcBorders>
+            <w:vAlign w:val="bottom"/>
+          </w:tcPr>
           <w:p>
             <w:pPr>
               <w:pStyle w:val="Compact"/>
@@ -3468,7 +3449,6 @@
       </w:tr>
       <w:tr>
         <w:tc>
-          <w:tcPr/>
           <w:p>
             <w:pPr>
               <w:pStyle w:val="Compact"/>
@@ -3483,7 +3463,6 @@
           </w:p>
         </w:tc>
         <w:tc>
-          <w:tcPr/>
           <w:p>
             <w:pPr>
               <w:pStyle w:val="Compact"/>
@@ -3534,7 +3513,6 @@
           </w:p>
         </w:tc>
         <w:tc>
-          <w:tcPr/>
           <w:p>
             <w:pPr>
               <w:pStyle w:val="Compact"/>
@@ -3546,7 +3524,6 @@
           </w:p>
         </w:tc>
         <w:tc>
-          <w:tcPr/>
           <w:p>
             <w:pPr>
               <w:pStyle w:val="Compact"/>
@@ -3599,7 +3576,6 @@
       </w:tr>
       <w:tr>
         <w:tc>
-          <w:tcPr/>
           <w:p>
             <w:pPr>
               <w:pStyle w:val="Compact"/>
@@ -3614,7 +3590,6 @@
           </w:p>
         </w:tc>
         <w:tc>
-          <w:tcPr/>
           <w:p>
             <w:pPr>
               <w:pStyle w:val="Compact"/>
@@ -3629,7 +3604,6 @@
           </w:p>
         </w:tc>
         <w:tc>
-          <w:tcPr/>
           <w:p>
             <w:pPr>
               <w:pStyle w:val="Compact"/>
@@ -3641,7 +3615,6 @@
           </w:p>
         </w:tc>
         <w:tc>
-          <w:tcPr/>
           <w:p>
             <w:pPr>
               <w:pStyle w:val="Compact"/>
@@ -3673,7 +3646,6 @@
       </w:tr>
       <w:tr>
         <w:tc>
-          <w:tcPr/>
           <w:p>
             <w:pPr>
               <w:pStyle w:val="Compact"/>
@@ -3688,7 +3660,6 @@
           </w:p>
         </w:tc>
         <w:tc>
-          <w:tcPr/>
           <w:p>
             <w:pPr>
               <w:pStyle w:val="Compact"/>
@@ -3703,7 +3674,6 @@
           </w:p>
         </w:tc>
         <w:tc>
-          <w:tcPr/>
           <w:p>
             <w:pPr>
               <w:pStyle w:val="Compact"/>
@@ -3715,7 +3685,6 @@
           </w:p>
         </w:tc>
         <w:tc>
-          <w:tcPr/>
           <w:p>
             <w:pPr>
               <w:pStyle w:val="Compact"/>
@@ -3732,7 +3701,6 @@
       </w:tr>
       <w:tr>
         <w:tc>
-          <w:tcPr/>
           <w:p>
             <w:pPr>
               <w:pStyle w:val="Compact"/>
@@ -3747,7 +3715,6 @@
           </w:p>
         </w:tc>
         <w:tc>
-          <w:tcPr/>
           <w:p>
             <w:pPr>
               <w:pStyle w:val="Compact"/>
@@ -3762,7 +3729,6 @@
           </w:p>
         </w:tc>
         <w:tc>
-          <w:tcPr/>
           <w:p>
             <w:pPr>
               <w:pStyle w:val="Compact"/>
@@ -3774,7 +3740,6 @@
           </w:p>
         </w:tc>
         <w:tc>
-          <w:tcPr/>
           <w:p>
             <w:pPr>
               <w:pStyle w:val="Compact"/>
@@ -3790,16 +3755,15 @@
         </w:tc>
       </w:tr>
     </w:tbl>
-    <w:bookmarkEnd w:id="31"/>
-    <w:bookmarkEnd w:id="32"/>
-    <w:bookmarkStart w:id="33" w:name="estados-de-la-orden"/>
     <w:p>
       <w:pPr>
         <w:pStyle w:val="Heading1"/>
       </w:pPr>
+      <w:bookmarkStart w:id="33" w:name="estados-de-la-orden"/>
       <w:r>
         <w:t xml:space="preserve">5. Estados de la orden</w:t>
       </w:r>
+      <w:bookmarkEnd w:id="33"/>
     </w:p>
     <w:p>
       <w:pPr>
@@ -3824,9 +3788,8 @@
     <w:tbl>
       <w:tblPr>
         <w:tblStyle w:val="Table"/>
-        <w:tblW w:type="pct" w:w="5000"/>
-        <w:tblLook w:firstRow="1" w:lastRow="0" w:firstColumn="0" w:lastColumn="0" w:noHBand="0" w:noVBand="0" w:val="0020"/>
-        <w:jc w:val="start"/>
+        <w:tblW w:type="pct" w:w="5000.0"/>
+        <w:tblLook w:firstRow="1"/>
       </w:tblPr>
       <w:tblGrid>
         <w:gridCol w:w="355"/>
@@ -3836,10 +3799,15 @@
       </w:tblGrid>
       <w:tr>
         <w:trPr>
-          <w:tblHeader w:val="true"/>
+          <w:cnfStyle w:firstRow="1"/>
         </w:trPr>
         <w:tc>
-          <w:tcPr/>
+          <w:tcPr>
+            <w:tcBorders>
+              <w:bottom w:val="single"/>
+            </w:tcBorders>
+            <w:vAlign w:val="bottom"/>
+          </w:tcPr>
           <w:p>
             <w:pPr>
               <w:pStyle w:val="Compact"/>
@@ -3851,7 +3819,12 @@
           </w:p>
         </w:tc>
         <w:tc>
-          <w:tcPr/>
+          <w:tcPr>
+            <w:tcBorders>
+              <w:bottom w:val="single"/>
+            </w:tcBorders>
+            <w:vAlign w:val="bottom"/>
+          </w:tcPr>
           <w:p>
             <w:pPr>
               <w:pStyle w:val="Compact"/>
@@ -3863,7 +3836,12 @@
           </w:p>
         </w:tc>
         <w:tc>
-          <w:tcPr/>
+          <w:tcPr>
+            <w:tcBorders>
+              <w:bottom w:val="single"/>
+            </w:tcBorders>
+            <w:vAlign w:val="bottom"/>
+          </w:tcPr>
           <w:p>
             <w:pPr>
               <w:pStyle w:val="Compact"/>
@@ -3875,7 +3853,12 @@
           </w:p>
         </w:tc>
         <w:tc>
-          <w:tcPr/>
+          <w:tcPr>
+            <w:tcBorders>
+              <w:bottom w:val="single"/>
+            </w:tcBorders>
+            <w:vAlign w:val="bottom"/>
+          </w:tcPr>
           <w:p>
             <w:pPr>
               <w:pStyle w:val="Compact"/>
@@ -3889,7 +3872,6 @@
       </w:tr>
       <w:tr>
         <w:tc>
-          <w:tcPr/>
           <w:p>
             <w:pPr>
               <w:pStyle w:val="Compact"/>
@@ -3901,7 +3883,6 @@
           </w:p>
         </w:tc>
         <w:tc>
-          <w:tcPr/>
           <w:p>
             <w:pPr>
               <w:pStyle w:val="Compact"/>
@@ -3916,7 +3897,6 @@
           </w:p>
         </w:tc>
         <w:tc>
-          <w:tcPr/>
           <w:p>
             <w:pPr>
               <w:pStyle w:val="Compact"/>
@@ -3928,7 +3908,6 @@
           </w:p>
         </w:tc>
         <w:tc>
-          <w:tcPr/>
           <w:p>
             <w:pPr>
               <w:pStyle w:val="Compact"/>
@@ -3942,7 +3921,6 @@
       </w:tr>
       <w:tr>
         <w:tc>
-          <w:tcPr/>
           <w:p>
             <w:pPr>
               <w:pStyle w:val="Compact"/>
@@ -3954,7 +3932,6 @@
           </w:p>
         </w:tc>
         <w:tc>
-          <w:tcPr/>
           <w:p>
             <w:pPr>
               <w:pStyle w:val="Compact"/>
@@ -3969,7 +3946,6 @@
           </w:p>
         </w:tc>
         <w:tc>
-          <w:tcPr/>
           <w:p>
             <w:pPr>
               <w:pStyle w:val="Compact"/>
@@ -3981,7 +3957,6 @@
           </w:p>
         </w:tc>
         <w:tc>
-          <w:tcPr/>
           <w:p>
             <w:pPr>
               <w:pStyle w:val="Compact"/>
@@ -3995,7 +3970,6 @@
       </w:tr>
       <w:tr>
         <w:tc>
-          <w:tcPr/>
           <w:p>
             <w:pPr>
               <w:pStyle w:val="Compact"/>
@@ -4007,7 +3981,6 @@
           </w:p>
         </w:tc>
         <w:tc>
-          <w:tcPr/>
           <w:p>
             <w:pPr>
               <w:pStyle w:val="Compact"/>
@@ -4022,7 +3995,6 @@
           </w:p>
         </w:tc>
         <w:tc>
-          <w:tcPr/>
           <w:p>
             <w:pPr>
               <w:pStyle w:val="Compact"/>
@@ -4034,7 +4006,6 @@
           </w:p>
         </w:tc>
         <w:tc>
-          <w:tcPr/>
           <w:p>
             <w:pPr>
               <w:pStyle w:val="Compact"/>
@@ -4048,7 +4019,6 @@
       </w:tr>
       <w:tr>
         <w:tc>
-          <w:tcPr/>
           <w:p>
             <w:pPr>
               <w:pStyle w:val="Compact"/>
@@ -4060,7 +4030,6 @@
           </w:p>
         </w:tc>
         <w:tc>
-          <w:tcPr/>
           <w:p>
             <w:pPr>
               <w:pStyle w:val="Compact"/>
@@ -4075,7 +4044,6 @@
           </w:p>
         </w:tc>
         <w:tc>
-          <w:tcPr/>
           <w:p>
             <w:pPr>
               <w:pStyle w:val="Compact"/>
@@ -4087,7 +4055,6 @@
           </w:p>
         </w:tc>
         <w:tc>
-          <w:tcPr/>
           <w:p>
             <w:pPr>
               <w:pStyle w:val="Compact"/>
@@ -4123,7 +4090,6 @@
       </w:pPr>
       <w:r>
         <w:rPr>
-          <w:bCs/>
           <w:b/>
         </w:rPr>
         <w:t xml:space="preserve">Cómo se controla que los estados solo avancen.</w:t>
@@ -4193,7 +4159,6 @@
       </w:r>
       <w:r>
         <w:rPr>
-          <w:bCs/>
           <w:b/>
         </w:rPr>
         <w:t xml:space="preserve">409</w:t>
@@ -4258,15 +4223,15 @@
         <w:t xml:space="preserve">atrás. El estado nunca se cambia en otro lugar del código.</w:t>
       </w:r>
     </w:p>
-    <w:bookmarkEnd w:id="33"/>
-    <w:bookmarkStart w:id="41" w:name="funcionamiento-de-cada-punto"/>
     <w:p>
       <w:pPr>
         <w:pStyle w:val="Heading1"/>
       </w:pPr>
+      <w:bookmarkStart w:id="34" w:name="funcionamiento-de-cada-punto"/>
       <w:r>
         <w:t xml:space="preserve">6. Funcionamiento de cada punto</w:t>
       </w:r>
+      <w:bookmarkEnd w:id="34"/>
     </w:p>
     <w:p>
       <w:pPr>
@@ -4321,14 +4286,15 @@
         <w:t xml:space="preserve">interno.</w:t>
       </w:r>
     </w:p>
-    <w:bookmarkStart w:id="34" w:name="punto-1-recepción-de-la-orden-sap"/>
     <w:p>
       <w:pPr>
         <w:pStyle w:val="Heading2"/>
       </w:pPr>
+      <w:bookmarkStart w:id="35" w:name="punto-1-recepción-de-la-orden-sap"/>
       <w:r>
         <w:t xml:space="preserve">6.1. Punto 1: recepción de la orden (SAP)</w:t>
       </w:r>
+      <w:bookmarkEnd w:id="35"/>
     </w:p>
     <w:p>
       <w:pPr>
@@ -4712,7 +4678,6 @@
       </w:r>
       <w:r>
         <w:rPr>
-          <w:bCs/>
           <w:b/>
         </w:rPr>
         <w:t xml:space="preserve">400</w:t>
@@ -4737,7 +4702,6 @@
       </w:r>
       <w:r>
         <w:rPr>
-          <w:bCs/>
           <w:b/>
         </w:rPr>
         <w:t xml:space="preserve">302</w:t>
@@ -4780,7 +4744,6 @@
       </w:pPr>
       <w:r>
         <w:rPr>
-          <w:bCs/>
           <w:b/>
         </w:rPr>
         <w:t xml:space="preserve">Sincroniza</w:t>
@@ -4873,7 +4836,6 @@
       </w:r>
       <w:r>
         <w:rPr>
-          <w:bCs/>
           <w:b/>
         </w:rPr>
         <w:t xml:space="preserve">201</w:t>
@@ -4897,15 +4859,15 @@
         <w:t xml:space="preserve">.</w:t>
       </w:r>
     </w:p>
-    <w:bookmarkEnd w:id="34"/>
-    <w:bookmarkStart w:id="35" w:name="punto-2-pesaje-inicial-tms"/>
     <w:p>
       <w:pPr>
         <w:pStyle w:val="Heading2"/>
       </w:pPr>
+      <w:bookmarkStart w:id="36" w:name="punto-2-pesaje-inicial-tms"/>
       <w:r>
         <w:t xml:space="preserve">6.2. Punto 2: pesaje inicial (TMS)</w:t>
       </w:r>
+      <w:bookmarkEnd w:id="36"/>
     </w:p>
     <w:p>
       <w:pPr>
@@ -4980,7 +4942,6 @@
       </w:r>
       <w:r>
         <w:rPr>
-          <w:bCs/>
           <w:b/>
         </w:rPr>
         <w:t xml:space="preserve">400</w:t>
@@ -4993,7 +4954,6 @@
       </w:r>
       <w:r>
         <w:rPr>
-          <w:bCs/>
           <w:b/>
         </w:rPr>
         <w:t xml:space="preserve">409</w:t>
@@ -5065,7 +5025,6 @@
       </w:r>
       <w:r>
         <w:rPr>
-          <w:bCs/>
           <w:b/>
         </w:rPr>
         <w:t xml:space="preserve">200</w:t>
@@ -5111,15 +5070,15 @@
         <w:t xml:space="preserve">).</w:t>
       </w:r>
     </w:p>
-    <w:bookmarkEnd w:id="35"/>
-    <w:bookmarkStart w:id="36" w:name="punto-3-activación-de-la-carga"/>
     <w:p>
       <w:pPr>
         <w:pStyle w:val="Heading2"/>
       </w:pPr>
+      <w:bookmarkStart w:id="37" w:name="punto-3-activación-de-la-carga"/>
       <w:r>
         <w:t xml:space="preserve">6.3. Punto 3: activación de la carga</w:t>
       </w:r>
+      <w:bookmarkEnd w:id="37"/>
     </w:p>
     <w:p>
       <w:pPr>
@@ -5179,7 +5138,6 @@
       </w:r>
       <w:r>
         <w:rPr>
-          <w:bCs/>
           <w:b/>
         </w:rPr>
         <w:t xml:space="preserve">404</w:t>
@@ -5192,7 +5150,6 @@
       </w:r>
       <w:r>
         <w:rPr>
-          <w:bCs/>
           <w:b/>
         </w:rPr>
         <w:t xml:space="preserve">409</w:t>
@@ -5211,7 +5168,6 @@
       </w:r>
       <w:r>
         <w:rPr>
-          <w:bCs/>
           <w:b/>
         </w:rPr>
         <w:t xml:space="preserve">400</w:t>
@@ -5245,15 +5201,15 @@
         <w:t xml:space="preserve">La orden no cambia de estado: sigue en estado 2 mientras se carga.</w:t>
       </w:r>
     </w:p>
-    <w:bookmarkEnd w:id="36"/>
-    <w:bookmarkStart w:id="37" w:name="punto-3-datos-de-carga-en-tiempo-real"/>
     <w:p>
       <w:pPr>
         <w:pStyle w:val="Heading2"/>
       </w:pPr>
+      <w:bookmarkStart w:id="38" w:name="punto-3-datos-de-carga-en-tiempo-real"/>
       <w:r>
         <w:t xml:space="preserve">6.4. Punto 3: datos de carga en tiempo real</w:t>
       </w:r>
+      <w:bookmarkEnd w:id="38"/>
     </w:p>
     <w:p>
       <w:pPr>
@@ -5328,7 +5284,6 @@
       </w:r>
       <w:r>
         <w:rPr>
-          <w:bCs/>
           <w:b/>
         </w:rPr>
         <w:t xml:space="preserve">409</w:t>
@@ -5353,7 +5308,6 @@
       </w:pPr>
       <w:r>
         <w:rPr>
-          <w:bCs/>
           <w:b/>
         </w:rPr>
         <w:t xml:space="preserve">Descarta</w:t>
@@ -5369,7 +5323,6 @@
       </w:r>
       <w:r>
         <w:rPr>
-          <w:bCs/>
           <w:b/>
         </w:rPr>
         <w:t xml:space="preserve">400</w:t>
@@ -5445,7 +5398,6 @@
       </w:r>
       <w:r>
         <w:rPr>
-          <w:bCs/>
           <w:b/>
         </w:rPr>
         <w:t xml:space="preserve">siempre</w:t>
@@ -5512,7 +5464,6 @@
       </w:r>
       <w:r>
         <w:rPr>
-          <w:bCs/>
           <w:b/>
         </w:rPr>
         <w:t xml:space="preserve">detalle</w:t>
@@ -5530,7 +5481,6 @@
       </w:pPr>
       <w:r>
         <w:rPr>
-          <w:bCs/>
           <w:b/>
         </w:rPr>
         <w:t xml:space="preserve">Frecuencia de almacenamiento.</w:t>
@@ -5596,15 +5546,15 @@
         <w:t xml:space="preserve">se guardan 6. Con el valor 0 se guardan todos.</w:t>
       </w:r>
     </w:p>
-    <w:bookmarkEnd w:id="37"/>
-    <w:bookmarkStart w:id="38" w:name="punto-4-cierre-de-la-orden"/>
     <w:p>
       <w:pPr>
         <w:pStyle w:val="Heading2"/>
       </w:pPr>
+      <w:bookmarkStart w:id="39" w:name="punto-4-cierre-de-la-orden"/>
       <w:r>
         <w:t xml:space="preserve">6.5. Punto 4: cierre de la orden</w:t>
       </w:r>
+      <w:bookmarkEnd w:id="39"/>
     </w:p>
     <w:p>
       <w:pPr>
@@ -5659,7 +5609,6 @@
       </w:r>
       <w:r>
         <w:rPr>
-          <w:bCs/>
           <w:b/>
         </w:rPr>
         <w:t xml:space="preserve">200</w:t>
@@ -5668,15 +5617,15 @@
         <w:t xml:space="preserve">.</w:t>
       </w:r>
     </w:p>
-    <w:bookmarkEnd w:id="38"/>
-    <w:bookmarkStart w:id="39" w:name="punto-5-pesaje-final-y-conciliación"/>
     <w:p>
       <w:pPr>
         <w:pStyle w:val="Heading2"/>
       </w:pPr>
+      <w:bookmarkStart w:id="40" w:name="punto-5-pesaje-final-y-conciliación"/>
       <w:r>
         <w:t xml:space="preserve">6.6. Punto 5: pesaje final y conciliación</w:t>
       </w:r>
+      <w:bookmarkEnd w:id="40"/>
     </w:p>
     <w:p>
       <w:pPr>
@@ -5767,7 +5716,6 @@
       </w:r>
       <w:r>
         <w:rPr>
-          <w:bCs/>
           <w:b/>
         </w:rPr>
         <w:t xml:space="preserve">409</w:t>
@@ -5880,9 +5828,8 @@
     <w:tbl>
       <w:tblPr>
         <w:tblStyle w:val="Table"/>
-        <w:tblW w:type="pct" w:w="5000"/>
-        <w:tblLook w:firstRow="1" w:lastRow="0" w:firstColumn="0" w:lastColumn="0" w:noHBand="0" w:noVBand="0" w:val="0020"/>
-        <w:jc w:val="start"/>
+        <w:tblW w:type="pct" w:w="5000.0"/>
+        <w:tblLook w:firstRow="1"/>
       </w:tblPr>
       <w:tblGrid>
         <w:gridCol w:w="2698"/>
@@ -5890,10 +5837,15 @@
       </w:tblGrid>
       <w:tr>
         <w:trPr>
-          <w:tblHeader w:val="true"/>
+          <w:cnfStyle w:firstRow="1"/>
         </w:trPr>
         <w:tc>
-          <w:tcPr/>
+          <w:tcPr>
+            <w:tcBorders>
+              <w:bottom w:val="single"/>
+            </w:tcBorders>
+            <w:vAlign w:val="bottom"/>
+          </w:tcPr>
           <w:p>
             <w:pPr>
               <w:pStyle w:val="Compact"/>
@@ -5905,7 +5857,12 @@
           </w:p>
         </w:tc>
         <w:tc>
-          <w:tcPr/>
+          <w:tcPr>
+            <w:tcBorders>
+              <w:bottom w:val="single"/>
+            </w:tcBorders>
+            <w:vAlign w:val="bottom"/>
+          </w:tcPr>
           <w:p>
             <w:pPr>
               <w:pStyle w:val="Compact"/>
@@ -5919,7 +5876,6 @@
       </w:tr>
       <w:tr>
         <w:tc>
-          <w:tcPr/>
           <w:p>
             <w:pPr>
               <w:pStyle w:val="Compact"/>
@@ -5934,7 +5890,6 @@
           </w:p>
         </w:tc>
         <w:tc>
-          <w:tcPr/>
           <w:p>
             <w:pPr>
               <w:pStyle w:val="Compact"/>
@@ -5948,7 +5903,6 @@
       </w:tr>
       <w:tr>
         <w:tc>
-          <w:tcPr/>
           <w:p>
             <w:pPr>
               <w:pStyle w:val="Compact"/>
@@ -5963,7 +5917,6 @@
           </w:p>
         </w:tc>
         <w:tc>
-          <w:tcPr/>
           <w:p>
             <w:pPr>
               <w:pStyle w:val="Compact"/>
@@ -5977,7 +5930,6 @@
       </w:tr>
       <w:tr>
         <w:tc>
-          <w:tcPr/>
           <w:p>
             <w:pPr>
               <w:pStyle w:val="Compact"/>
@@ -5992,7 +5944,6 @@
           </w:p>
         </w:tc>
         <w:tc>
-          <w:tcPr/>
           <w:p>
             <w:pPr>
               <w:pStyle w:val="Compact"/>
@@ -6006,7 +5957,6 @@
       </w:tr>
       <w:tr>
         <w:tc>
-          <w:tcPr/>
           <w:p>
             <w:pPr>
               <w:pStyle w:val="Compact"/>
@@ -6018,7 +5968,6 @@
           </w:p>
         </w:tc>
         <w:tc>
-          <w:tcPr/>
           <w:p>
             <w:pPr>
               <w:pStyle w:val="Compact"/>
@@ -6084,22 +6033,21 @@
         <w:t xml:space="preserve">). Así no puede quedar desactualizada.</w:t>
       </w:r>
     </w:p>
-    <w:bookmarkEnd w:id="39"/>
-    <w:bookmarkStart w:id="40" w:name="consultas"/>
     <w:p>
       <w:pPr>
         <w:pStyle w:val="Heading2"/>
       </w:pPr>
+      <w:bookmarkStart w:id="41" w:name="consultas"/>
       <w:r>
         <w:t xml:space="preserve">6.7. Consultas</w:t>
       </w:r>
+      <w:bookmarkEnd w:id="41"/>
     </w:p>
     <w:tbl>
       <w:tblPr>
         <w:tblStyle w:val="Table"/>
-        <w:tblW w:type="pct" w:w="5000"/>
-        <w:tblLook w:firstRow="1" w:lastRow="0" w:firstColumn="0" w:lastColumn="0" w:noHBand="0" w:noVBand="0" w:val="0020"/>
-        <w:jc w:val="start"/>
+        <w:tblW w:type="pct" w:w="5000.0"/>
+        <w:tblLook w:firstRow="1"/>
       </w:tblPr>
       <w:tblGrid>
         <w:gridCol w:w="3520"/>
@@ -6107,10 +6055,15 @@
       </w:tblGrid>
       <w:tr>
         <w:trPr>
-          <w:tblHeader w:val="true"/>
+          <w:cnfStyle w:firstRow="1"/>
         </w:trPr>
         <w:tc>
-          <w:tcPr/>
+          <w:tcPr>
+            <w:tcBorders>
+              <w:bottom w:val="single"/>
+            </w:tcBorders>
+            <w:vAlign w:val="bottom"/>
+          </w:tcPr>
           <w:p>
             <w:pPr>
               <w:pStyle w:val="Compact"/>
@@ -6122,7 +6075,12 @@
           </w:p>
         </w:tc>
         <w:tc>
-          <w:tcPr/>
+          <w:tcPr>
+            <w:tcBorders>
+              <w:bottom w:val="single"/>
+            </w:tcBorders>
+            <w:vAlign w:val="bottom"/>
+          </w:tcPr>
           <w:p>
             <w:pPr>
               <w:pStyle w:val="Compact"/>
@@ -6136,7 +6094,6 @@
       </w:tr>
       <w:tr>
         <w:tc>
-          <w:tcPr/>
           <w:p>
             <w:pPr>
               <w:pStyle w:val="Compact"/>
@@ -6151,7 +6108,6 @@
           </w:p>
         </w:tc>
         <w:tc>
-          <w:tcPr/>
           <w:p>
             <w:pPr>
               <w:pStyle w:val="Compact"/>
@@ -6165,7 +6121,6 @@
       </w:tr>
       <w:tr>
         <w:tc>
-          <w:tcPr/>
           <w:p>
             <w:pPr>
               <w:pStyle w:val="Compact"/>
@@ -6180,7 +6135,6 @@
           </w:p>
         </w:tc>
         <w:tc>
-          <w:tcPr/>
           <w:p>
             <w:pPr>
               <w:pStyle w:val="Compact"/>
@@ -6194,7 +6148,6 @@
       </w:tr>
       <w:tr>
         <w:tc>
-          <w:tcPr/>
           <w:p>
             <w:pPr>
               <w:pStyle w:val="Compact"/>
@@ -6209,7 +6162,6 @@
           </w:p>
         </w:tc>
         <w:tc>
-          <w:tcPr/>
           <w:p>
             <w:pPr>
               <w:pStyle w:val="Compact"/>
@@ -6223,7 +6175,6 @@
       </w:tr>
       <w:tr>
         <w:tc>
-          <w:tcPr/>
           <w:p>
             <w:pPr>
               <w:pStyle w:val="Compact"/>
@@ -6238,7 +6189,6 @@
           </w:p>
         </w:tc>
         <w:tc>
-          <w:tcPr/>
           <w:p>
             <w:pPr>
               <w:pStyle w:val="Compact"/>
@@ -6286,16 +6236,15 @@
         <w:t xml:space="preserve">); el frontend del final las va a usar.</w:t>
       </w:r>
     </w:p>
-    <w:bookmarkEnd w:id="40"/>
-    <w:bookmarkEnd w:id="41"/>
-    <w:bookmarkStart w:id="42" w:name="manejo-de-errores"/>
     <w:p>
       <w:pPr>
         <w:pStyle w:val="Heading1"/>
       </w:pPr>
+      <w:bookmarkStart w:id="42" w:name="manejo-de-errores"/>
       <w:r>
         <w:t xml:space="preserve">7. Manejo de errores</w:t>
       </w:r>
+      <w:bookmarkEnd w:id="42"/>
     </w:p>
     <w:p>
       <w:pPr>
@@ -6395,9 +6344,8 @@
     <w:tbl>
       <w:tblPr>
         <w:tblStyle w:val="Table"/>
-        <w:tblW w:type="pct" w:w="5000"/>
-        <w:tblLook w:firstRow="1" w:lastRow="0" w:firstColumn="0" w:lastColumn="0" w:noHBand="0" w:noVBand="0" w:val="0020"/>
-        <w:jc w:val="start"/>
+        <w:tblW w:type="pct" w:w="5000.0"/>
+        <w:tblLook w:firstRow="1"/>
       </w:tblPr>
       <w:tblGrid>
         <w:gridCol w:w="1911"/>
@@ -6406,10 +6354,15 @@
       </w:tblGrid>
       <w:tr>
         <w:trPr>
-          <w:tblHeader w:val="true"/>
+          <w:cnfStyle w:firstRow="1"/>
         </w:trPr>
         <w:tc>
-          <w:tcPr/>
+          <w:tcPr>
+            <w:tcBorders>
+              <w:bottom w:val="single"/>
+            </w:tcBorders>
+            <w:vAlign w:val="bottom"/>
+          </w:tcPr>
           <w:p>
             <w:pPr>
               <w:pStyle w:val="Compact"/>
@@ -6421,7 +6374,12 @@
           </w:p>
         </w:tc>
         <w:tc>
-          <w:tcPr/>
+          <w:tcPr>
+            <w:tcBorders>
+              <w:bottom w:val="single"/>
+            </w:tcBorders>
+            <w:vAlign w:val="bottom"/>
+          </w:tcPr>
           <w:p>
             <w:pPr>
               <w:pStyle w:val="Compact"/>
@@ -6433,7 +6391,12 @@
           </w:p>
         </w:tc>
         <w:tc>
-          <w:tcPr/>
+          <w:tcPr>
+            <w:tcBorders>
+              <w:bottom w:val="single"/>
+            </w:tcBorders>
+            <w:vAlign w:val="bottom"/>
+          </w:tcPr>
           <w:p>
             <w:pPr>
               <w:pStyle w:val="Compact"/>
@@ -6447,7 +6410,6 @@
       </w:tr>
       <w:tr>
         <w:tc>
-          <w:tcPr/>
           <w:p>
             <w:pPr>
               <w:pStyle w:val="Compact"/>
@@ -6462,7 +6424,6 @@
           </w:p>
         </w:tc>
         <w:tc>
-          <w:tcPr/>
           <w:p>
             <w:pPr>
               <w:pStyle w:val="Compact"/>
@@ -6474,7 +6435,6 @@
           </w:p>
         </w:tc>
         <w:tc>
-          <w:tcPr/>
           <w:p>
             <w:pPr>
               <w:pStyle w:val="Compact"/>
@@ -6488,7 +6448,6 @@
       </w:tr>
       <w:tr>
         <w:tc>
-          <w:tcPr/>
           <w:p>
             <w:pPr>
               <w:pStyle w:val="Compact"/>
@@ -6503,7 +6462,6 @@
           </w:p>
         </w:tc>
         <w:tc>
-          <w:tcPr/>
           <w:p>
             <w:pPr>
               <w:pStyle w:val="Compact"/>
@@ -6515,7 +6473,6 @@
           </w:p>
         </w:tc>
         <w:tc>
-          <w:tcPr/>
           <w:p>
             <w:pPr>
               <w:pStyle w:val="Compact"/>
@@ -6529,7 +6486,6 @@
       </w:tr>
       <w:tr>
         <w:tc>
-          <w:tcPr/>
           <w:p>
             <w:pPr>
               <w:pStyle w:val="Compact"/>
@@ -6544,7 +6500,6 @@
           </w:p>
         </w:tc>
         <w:tc>
-          <w:tcPr/>
           <w:p>
             <w:pPr>
               <w:pStyle w:val="Compact"/>
@@ -6556,7 +6511,6 @@
           </w:p>
         </w:tc>
         <w:tc>
-          <w:tcPr/>
           <w:p>
             <w:pPr>
               <w:pStyle w:val="Compact"/>
@@ -6570,7 +6524,6 @@
       </w:tr>
       <w:tr>
         <w:tc>
-          <w:tcPr/>
           <w:p>
             <w:pPr>
               <w:pStyle w:val="Compact"/>
@@ -6585,7 +6538,6 @@
           </w:p>
         </w:tc>
         <w:tc>
-          <w:tcPr/>
           <w:p>
             <w:pPr>
               <w:pStyle w:val="Compact"/>
@@ -6597,7 +6549,6 @@
           </w:p>
         </w:tc>
         <w:tc>
-          <w:tcPr/>
           <w:p>
             <w:pPr>
               <w:pStyle w:val="Compact"/>
@@ -6611,7 +6562,6 @@
       </w:tr>
       <w:tr>
         <w:tc>
-          <w:tcPr/>
           <w:p>
             <w:pPr>
               <w:pStyle w:val="Compact"/>
@@ -6626,7 +6576,6 @@
           </w:p>
         </w:tc>
         <w:tc>
-          <w:tcPr/>
           <w:p>
             <w:pPr>
               <w:pStyle w:val="Compact"/>
@@ -6638,7 +6587,6 @@
           </w:p>
         </w:tc>
         <w:tc>
-          <w:tcPr/>
           <w:p>
             <w:pPr>
               <w:pStyle w:val="Compact"/>
@@ -6722,7 +6670,6 @@
       </w:r>
       <w:r>
         <w:rPr>
-          <w:bCs/>
           <w:b/>
         </w:rPr>
         <w:t xml:space="preserve">401</w:t>
@@ -6738,7 +6685,6 @@
       </w:r>
       <w:r>
         <w:rPr>
-          <w:bCs/>
           <w:b/>
         </w:rPr>
         <w:t xml:space="preserve">403</w:t>
@@ -6756,24 +6702,25 @@
         <w:t xml:space="preserve">no tiene el rol necesario.</w:t>
       </w:r>
     </w:p>
-    <w:bookmarkEnd w:id="42"/>
-    <w:bookmarkStart w:id="47" w:name="seguridad"/>
     <w:p>
       <w:pPr>
         <w:pStyle w:val="Heading1"/>
       </w:pPr>
+      <w:bookmarkStart w:id="43" w:name="seguridad"/>
       <w:r>
         <w:t xml:space="preserve">8. Seguridad</w:t>
       </w:r>
-    </w:p>
-    <w:bookmarkStart w:id="43" w:name="login-con-jwt-del-proyecto-base"/>
+      <w:bookmarkEnd w:id="43"/>
+    </w:p>
     <w:p>
       <w:pPr>
         <w:pStyle w:val="Heading2"/>
       </w:pPr>
+      <w:bookmarkStart w:id="44" w:name="login-con-jwt-del-proyecto-base"/>
       <w:r>
         <w:t xml:space="preserve">8.1. Login con JWT (del proyecto base)</w:t>
       </w:r>
+      <w:bookmarkEnd w:id="44"/>
     </w:p>
     <w:p>
       <w:pPr>
@@ -6925,15 +6872,15 @@
         <w:t xml:space="preserve">verifica la firma y carga el usuario con sus roles.</w:t>
       </w:r>
     </w:p>
-    <w:bookmarkEnd w:id="43"/>
-    <w:bookmarkStart w:id="44" w:name="roles"/>
     <w:p>
       <w:pPr>
         <w:pStyle w:val="Heading2"/>
       </w:pPr>
+      <w:bookmarkStart w:id="45" w:name="roles"/>
       <w:r>
         <w:t xml:space="preserve">8.2. Roles</w:t>
       </w:r>
+      <w:bookmarkEnd w:id="45"/>
     </w:p>
     <w:p>
       <w:pPr>
@@ -6952,9 +6899,8 @@
     <w:tbl>
       <w:tblPr>
         <w:tblStyle w:val="Table"/>
-        <w:tblW w:type="pct" w:w="5000"/>
-        <w:tblLook w:firstRow="1" w:lastRow="0" w:firstColumn="0" w:lastColumn="0" w:noHBand="0" w:noVBand="0" w:val="0020"/>
-        <w:jc w:val="start"/>
+        <w:tblW w:type="pct" w:w="5000.0"/>
+        <w:tblLook w:firstRow="1"/>
       </w:tblPr>
       <w:tblGrid>
         <w:gridCol w:w="1485"/>
@@ -6963,10 +6909,15 @@
       </w:tblGrid>
       <w:tr>
         <w:trPr>
-          <w:tblHeader w:val="true"/>
+          <w:cnfStyle w:firstRow="1"/>
         </w:trPr>
         <w:tc>
-          <w:tcPr/>
+          <w:tcPr>
+            <w:tcBorders>
+              <w:bottom w:val="single"/>
+            </w:tcBorders>
+            <w:vAlign w:val="bottom"/>
+          </w:tcPr>
           <w:p>
             <w:pPr>
               <w:pStyle w:val="Compact"/>
@@ -6978,7 +6929,12 @@
           </w:p>
         </w:tc>
         <w:tc>
-          <w:tcPr/>
+          <w:tcPr>
+            <w:tcBorders>
+              <w:bottom w:val="single"/>
+            </w:tcBorders>
+            <w:vAlign w:val="bottom"/>
+          </w:tcPr>
           <w:p>
             <w:pPr>
               <w:pStyle w:val="Compact"/>
@@ -6990,7 +6946,12 @@
           </w:p>
         </w:tc>
         <w:tc>
-          <w:tcPr/>
+          <w:tcPr>
+            <w:tcBorders>
+              <w:bottom w:val="single"/>
+            </w:tcBorders>
+            <w:vAlign w:val="bottom"/>
+          </w:tcPr>
           <w:p>
             <w:pPr>
               <w:pStyle w:val="Compact"/>
@@ -7004,7 +6965,6 @@
       </w:tr>
       <w:tr>
         <w:tc>
-          <w:tcPr/>
           <w:p>
             <w:pPr>
               <w:pStyle w:val="Compact"/>
@@ -7019,7 +6979,6 @@
           </w:p>
         </w:tc>
         <w:tc>
-          <w:tcPr/>
           <w:p>
             <w:pPr>
               <w:pStyle w:val="Compact"/>
@@ -7034,7 +6993,6 @@
           </w:p>
         </w:tc>
         <w:tc>
-          <w:tcPr/>
           <w:p>
             <w:pPr>
               <w:pStyle w:val="Compact"/>
@@ -7048,7 +7006,6 @@
       </w:tr>
       <w:tr>
         <w:tc>
-          <w:tcPr/>
           <w:p>
             <w:pPr>
               <w:pStyle w:val="Compact"/>
@@ -7063,7 +7020,6 @@
           </w:p>
         </w:tc>
         <w:tc>
-          <w:tcPr/>
           <w:p>
             <w:pPr>
               <w:pStyle w:val="Compact"/>
@@ -7078,7 +7034,6 @@
           </w:p>
         </w:tc>
         <w:tc>
-          <w:tcPr/>
           <w:p>
             <w:pPr>
               <w:pStyle w:val="Compact"/>
@@ -7092,7 +7047,6 @@
       </w:tr>
       <w:tr>
         <w:tc>
-          <w:tcPr/>
           <w:p>
             <w:pPr>
               <w:pStyle w:val="Compact"/>
@@ -7107,7 +7061,6 @@
           </w:p>
         </w:tc>
         <w:tc>
-          <w:tcPr/>
           <w:p>
             <w:pPr>
               <w:pStyle w:val="Compact"/>
@@ -7122,7 +7075,6 @@
           </w:p>
         </w:tc>
         <w:tc>
-          <w:tcPr/>
           <w:p>
             <w:pPr>
               <w:pStyle w:val="Compact"/>
@@ -7136,7 +7088,6 @@
       </w:tr>
       <w:tr>
         <w:tc>
-          <w:tcPr/>
           <w:p>
             <w:pPr>
               <w:pStyle w:val="Compact"/>
@@ -7151,7 +7102,6 @@
           </w:p>
         </w:tc>
         <w:tc>
-          <w:tcPr/>
           <w:p>
             <w:pPr>
               <w:pStyle w:val="Compact"/>
@@ -7166,7 +7116,6 @@
           </w:p>
         </w:tc>
         <w:tc>
-          <w:tcPr/>
           <w:p>
             <w:pPr>
               <w:pStyle w:val="Compact"/>
@@ -7180,7 +7129,6 @@
       </w:tr>
       <w:tr>
         <w:tc>
-          <w:tcPr/>
           <w:p>
             <w:pPr>
               <w:pStyle w:val="Compact"/>
@@ -7195,7 +7143,6 @@
           </w:p>
         </w:tc>
         <w:tc>
-          <w:tcPr/>
           <w:p>
             <w:pPr>
               <w:pStyle w:val="Compact"/>
@@ -7210,7 +7157,6 @@
           </w:p>
         </w:tc>
         <w:tc>
-          <w:tcPr/>
           <w:p>
             <w:pPr>
               <w:pStyle w:val="Compact"/>
@@ -7270,15 +7216,15 @@
         <w:t xml:space="preserve">al comparar.</w:t>
       </w:r>
     </w:p>
-    <w:bookmarkEnd w:id="44"/>
-    <w:bookmarkStart w:id="45" w:name="usuarios-iniciales"/>
     <w:p>
       <w:pPr>
         <w:pStyle w:val="Heading2"/>
       </w:pPr>
+      <w:bookmarkStart w:id="46" w:name="usuarios-iniciales"/>
       <w:r>
         <w:t xml:space="preserve">8.3. Usuarios iniciales</w:t>
       </w:r>
+      <w:bookmarkEnd w:id="46"/>
     </w:p>
     <w:p>
       <w:pPr>
@@ -7372,15 +7318,15 @@
         <w:t xml:space="preserve">).</w:t>
       </w:r>
     </w:p>
-    <w:bookmarkEnd w:id="45"/>
-    <w:bookmarkStart w:id="46" w:name="ajuste-en-securityconfiguration"/>
     <w:p>
       <w:pPr>
         <w:pStyle w:val="Heading2"/>
       </w:pPr>
+      <w:bookmarkStart w:id="47" w:name="ajuste-en-securityconfiguration"/>
       <w:r>
         <w:t xml:space="preserve">8.4. Ajuste en SecurityConfiguration</w:t>
       </w:r>
+      <w:bookmarkEnd w:id="47"/>
     </w:p>
     <w:p>
       <w:pPr>
@@ -7426,32 +7372,31 @@
         <w:t xml:space="preserve">respuesta terminaba siendo 401 en lugar de 403.</w:t>
       </w:r>
     </w:p>
-    <w:bookmarkEnd w:id="46"/>
-    <w:bookmarkEnd w:id="47"/>
-    <w:bookmarkStart w:id="50" w:name="configuración"/>
     <w:p>
       <w:pPr>
         <w:pStyle w:val="Heading1"/>
       </w:pPr>
+      <w:bookmarkStart w:id="48" w:name="configuración"/>
       <w:r>
         <w:t xml:space="preserve">9. Configuración</w:t>
       </w:r>
-    </w:p>
-    <w:bookmarkStart w:id="48" w:name="perfiles"/>
+      <w:bookmarkEnd w:id="48"/>
+    </w:p>
     <w:p>
       <w:pPr>
         <w:pStyle w:val="Heading2"/>
       </w:pPr>
+      <w:bookmarkStart w:id="49" w:name="perfiles"/>
       <w:r>
         <w:t xml:space="preserve">9.1. Perfiles</w:t>
       </w:r>
+      <w:bookmarkEnd w:id="49"/>
     </w:p>
     <w:tbl>
       <w:tblPr>
         <w:tblStyle w:val="Table"/>
-        <w:tblW w:type="pct" w:w="5000"/>
-        <w:tblLook w:firstRow="1" w:lastRow="0" w:firstColumn="0" w:lastColumn="0" w:noHBand="0" w:noVBand="0" w:val="0020"/>
-        <w:jc w:val="start"/>
+        <w:tblW w:type="pct" w:w="5000.0"/>
+        <w:tblLook w:firstRow="1"/>
       </w:tblPr>
       <w:tblGrid>
         <w:gridCol w:w="806"/>
@@ -7460,10 +7405,15 @@
       </w:tblGrid>
       <w:tr>
         <w:trPr>
-          <w:tblHeader w:val="true"/>
+          <w:cnfStyle w:firstRow="1"/>
         </w:trPr>
         <w:tc>
-          <w:tcPr/>
+          <w:tcPr>
+            <w:tcBorders>
+              <w:bottom w:val="single"/>
+            </w:tcBorders>
+            <w:vAlign w:val="bottom"/>
+          </w:tcPr>
           <w:p>
             <w:pPr>
               <w:pStyle w:val="Compact"/>
@@ -7475,7 +7425,12 @@
           </w:p>
         </w:tc>
         <w:tc>
-          <w:tcPr/>
+          <w:tcPr>
+            <w:tcBorders>
+              <w:bottom w:val="single"/>
+            </w:tcBorders>
+            <w:vAlign w:val="bottom"/>
+          </w:tcPr>
           <w:p>
             <w:pPr>
               <w:pStyle w:val="Compact"/>
@@ -7487,7 +7442,12 @@
           </w:p>
         </w:tc>
         <w:tc>
-          <w:tcPr/>
+          <w:tcPr>
+            <w:tcBorders>
+              <w:bottom w:val="single"/>
+            </w:tcBorders>
+            <w:vAlign w:val="bottom"/>
+          </w:tcPr>
           <w:p>
             <w:pPr>
               <w:pStyle w:val="Compact"/>
@@ -7501,7 +7461,6 @@
       </w:tr>
       <w:tr>
         <w:tc>
-          <w:tcPr/>
           <w:p>
             <w:pPr>
               <w:pStyle w:val="Compact"/>
@@ -7516,7 +7475,6 @@
           </w:p>
         </w:tc>
         <w:tc>
-          <w:tcPr/>
           <w:p>
             <w:pPr>
               <w:pStyle w:val="Compact"/>
@@ -7528,7 +7486,6 @@
           </w:p>
         </w:tc>
         <w:tc>
-          <w:tcPr/>
           <w:p>
             <w:pPr>
               <w:pStyle w:val="Compact"/>
@@ -7557,7 +7514,6 @@
       </w:tr>
       <w:tr>
         <w:tc>
-          <w:tcPr/>
           <w:p>
             <w:pPr>
               <w:pStyle w:val="Compact"/>
@@ -7572,7 +7528,6 @@
           </w:p>
         </w:tc>
         <w:tc>
-          <w:tcPr/>
           <w:p>
             <w:pPr>
               <w:pStyle w:val="Compact"/>
@@ -7584,7 +7539,6 @@
           </w:p>
         </w:tc>
         <w:tc>
-          <w:tcPr/>
           <w:p>
             <w:pPr>
               <w:pStyle w:val="Compact"/>
@@ -7698,22 +7652,21 @@
         <w:t xml:space="preserve">compilar.</w:t>
       </w:r>
     </w:p>
-    <w:bookmarkEnd w:id="48"/>
-    <w:bookmarkStart w:id="49" w:name="propiedades-propias"/>
     <w:p>
       <w:pPr>
         <w:pStyle w:val="Heading2"/>
       </w:pPr>
+      <w:bookmarkStart w:id="50" w:name="propiedades-propias"/>
       <w:r>
         <w:t xml:space="preserve">9.2. Propiedades propias</w:t>
       </w:r>
+      <w:bookmarkEnd w:id="50"/>
     </w:p>
     <w:tbl>
       <w:tblPr>
         <w:tblStyle w:val="Table"/>
-        <w:tblW w:type="pct" w:w="5000"/>
-        <w:tblLook w:firstRow="1" w:lastRow="0" w:firstColumn="0" w:lastColumn="0" w:noHBand="0" w:noVBand="0" w:val="0020"/>
-        <w:jc w:val="start"/>
+        <w:tblW w:type="pct" w:w="5000.0"/>
+        <w:tblLook w:firstRow="1"/>
       </w:tblPr>
       <w:tblGrid>
         <w:gridCol w:w="2566"/>
@@ -7722,10 +7675,15 @@
       </w:tblGrid>
       <w:tr>
         <w:trPr>
-          <w:tblHeader w:val="true"/>
+          <w:cnfStyle w:firstRow="1"/>
         </w:trPr>
         <w:tc>
-          <w:tcPr/>
+          <w:tcPr>
+            <w:tcBorders>
+              <w:bottom w:val="single"/>
+            </w:tcBorders>
+            <w:vAlign w:val="bottom"/>
+          </w:tcPr>
           <w:p>
             <w:pPr>
               <w:pStyle w:val="Compact"/>
@@ -7737,7 +7695,12 @@
           </w:p>
         </w:tc>
         <w:tc>
-          <w:tcPr/>
+          <w:tcPr>
+            <w:tcBorders>
+              <w:bottom w:val="single"/>
+            </w:tcBorders>
+            <w:vAlign w:val="bottom"/>
+          </w:tcPr>
           <w:p>
             <w:pPr>
               <w:pStyle w:val="Compact"/>
@@ -7749,7 +7712,12 @@
           </w:p>
         </w:tc>
         <w:tc>
-          <w:tcPr/>
+          <w:tcPr>
+            <w:tcBorders>
+              <w:bottom w:val="single"/>
+            </w:tcBorders>
+            <w:vAlign w:val="bottom"/>
+          </w:tcPr>
           <w:p>
             <w:pPr>
               <w:pStyle w:val="Compact"/>
@@ -7763,7 +7731,6 @@
       </w:tr>
       <w:tr>
         <w:tc>
-          <w:tcPr/>
           <w:p>
             <w:pPr>
               <w:pStyle w:val="Compact"/>
@@ -7778,7 +7745,6 @@
           </w:p>
         </w:tc>
         <w:tc>
-          <w:tcPr/>
           <w:p>
             <w:pPr>
               <w:pStyle w:val="Compact"/>
@@ -7790,7 +7756,6 @@
           </w:p>
         </w:tc>
         <w:tc>
-          <w:tcPr/>
           <w:p>
             <w:pPr>
               <w:pStyle w:val="Compact"/>
@@ -7804,7 +7769,6 @@
       </w:tr>
       <w:tr>
         <w:tc>
-          <w:tcPr/>
           <w:p>
             <w:pPr>
               <w:pStyle w:val="Compact"/>
@@ -7819,7 +7783,6 @@
           </w:p>
         </w:tc>
         <w:tc>
-          <w:tcPr/>
           <w:p>
             <w:pPr>
               <w:pStyle w:val="Compact"/>
@@ -7852,7 +7815,6 @@
           </w:p>
         </w:tc>
         <w:tc>
-          <w:tcPr/>
           <w:p>
             <w:pPr>
               <w:pStyle w:val="Compact"/>
@@ -7866,7 +7828,6 @@
       </w:tr>
       <w:tr>
         <w:tc>
-          <w:tcPr/>
           <w:p>
             <w:pPr>
               <w:pStyle w:val="Compact"/>
@@ -7896,7 +7857,6 @@
           </w:p>
         </w:tc>
         <w:tc>
-          <w:tcPr/>
           <w:p>
             <w:pPr>
               <w:pStyle w:val="Compact"/>
@@ -7926,7 +7886,6 @@
           </w:p>
         </w:tc>
         <w:tc>
-          <w:tcPr/>
           <w:p>
             <w:pPr>
               <w:pStyle w:val="Compact"/>
@@ -7947,16 +7906,15 @@
         <w:t xml:space="preserve">Las contraseñas de mail no están en el repo: se pasan por variables de entorno.</w:t>
       </w:r>
     </w:p>
-    <w:bookmarkEnd w:id="49"/>
-    <w:bookmarkEnd w:id="50"/>
-    <w:bookmarkStart w:id="51" w:name="documentación-openapi-swagger"/>
     <w:p>
       <w:pPr>
         <w:pStyle w:val="Heading1"/>
       </w:pPr>
+      <w:bookmarkStart w:id="51" w:name="documentación-openapi-swagger"/>
       <w:r>
         <w:t xml:space="preserve">10. Documentación OpenAPI (Swagger)</w:t>
       </w:r>
+      <w:bookmarkEnd w:id="51"/>
     </w:p>
     <w:p>
       <w:pPr>
@@ -8104,7 +8062,6 @@
       </w:r>
       <w:r>
         <w:rPr>
-          <w:bCs/>
           <w:b/>
         </w:rPr>
         <w:t xml:space="preserve">Authorize</w:t>
@@ -8113,15 +8070,15 @@
         <w:t xml:space="preserve">.</w:t>
       </w:r>
     </w:p>
-    <w:bookmarkEnd w:id="51"/>
-    <w:bookmarkStart w:id="52" w:name="pruebas-con-postman"/>
     <w:p>
       <w:pPr>
         <w:pStyle w:val="Heading1"/>
       </w:pPr>
+      <w:bookmarkStart w:id="52" w:name="pruebas-con-postman"/>
       <w:r>
         <w:t xml:space="preserve">11. Pruebas con Postman</w:t>
       </w:r>
+      <w:bookmarkEnd w:id="52"/>
     </w:p>
     <w:p>
       <w:pPr>
@@ -8185,9 +8142,8 @@
     <w:tbl>
       <w:tblPr>
         <w:tblStyle w:val="Table"/>
-        <w:tblW w:type="pct" w:w="5000"/>
-        <w:tblLook w:firstRow="1" w:lastRow="0" w:firstColumn="0" w:lastColumn="0" w:noHBand="0" w:noVBand="0" w:val="0020"/>
-        <w:jc w:val="start"/>
+        <w:tblW w:type="pct" w:w="5000.0"/>
+        <w:tblLook w:firstRow="1"/>
       </w:tblPr>
       <w:tblGrid>
         <w:gridCol w:w="2053"/>
@@ -8195,10 +8151,15 @@
       </w:tblGrid>
       <w:tr>
         <w:trPr>
-          <w:tblHeader w:val="true"/>
+          <w:cnfStyle w:firstRow="1"/>
         </w:trPr>
         <w:tc>
-          <w:tcPr/>
+          <w:tcPr>
+            <w:tcBorders>
+              <w:bottom w:val="single"/>
+            </w:tcBorders>
+            <w:vAlign w:val="bottom"/>
+          </w:tcPr>
           <w:p>
             <w:pPr>
               <w:pStyle w:val="Compact"/>
@@ -8210,7 +8171,12 @@
           </w:p>
         </w:tc>
         <w:tc>
-          <w:tcPr/>
+          <w:tcPr>
+            <w:tcBorders>
+              <w:bottom w:val="single"/>
+            </w:tcBorders>
+            <w:vAlign w:val="bottom"/>
+          </w:tcPr>
           <w:p>
             <w:pPr>
               <w:pStyle w:val="Compact"/>
@@ -8224,7 +8190,6 @@
       </w:tr>
       <w:tr>
         <w:tc>
-          <w:tcPr/>
           <w:p>
             <w:pPr>
               <w:pStyle w:val="Compact"/>
@@ -8236,7 +8201,6 @@
           </w:p>
         </w:tc>
         <w:tc>
-          <w:tcPr/>
           <w:p>
             <w:pPr>
               <w:pStyle w:val="Compact"/>
@@ -8283,7 +8247,6 @@
       </w:tr>
       <w:tr>
         <w:tc>
-          <w:tcPr/>
           <w:p>
             <w:pPr>
               <w:pStyle w:val="Compact"/>
@@ -8295,7 +8258,6 @@
           </w:p>
         </w:tc>
         <w:tc>
-          <w:tcPr/>
           <w:p>
             <w:pPr>
               <w:pStyle w:val="Compact"/>
@@ -8309,7 +8271,6 @@
       </w:tr>
       <w:tr>
         <w:tc>
-          <w:tcPr/>
           <w:p>
             <w:pPr>
               <w:pStyle w:val="Compact"/>
@@ -8321,7 +8282,6 @@
           </w:p>
         </w:tc>
         <w:tc>
-          <w:tcPr/>
           <w:p>
             <w:pPr>
               <w:pStyle w:val="Compact"/>
@@ -8335,7 +8295,6 @@
       </w:tr>
       <w:tr>
         <w:tc>
-          <w:tcPr/>
           <w:p>
             <w:pPr>
               <w:pStyle w:val="Compact"/>
@@ -8347,7 +8306,6 @@
           </w:p>
         </w:tc>
         <w:tc>
-          <w:tcPr/>
           <w:p>
             <w:pPr>
               <w:pStyle w:val="Compact"/>
@@ -8390,7 +8348,6 @@
       </w:r>
       <w:r>
         <w:rPr>
-          <w:bCs/>
           <w:b/>
         </w:rPr>
         <w:t xml:space="preserve">Runner</w:t>
@@ -8410,15 +8367,15 @@
         <w:t xml:space="preserve">Resultado de la última corrida: 29 requests, 33 tests, 0 fallas.</w:t>
       </w:r>
     </w:p>
-    <w:bookmarkEnd w:id="52"/>
-    <w:bookmarkStart w:id="53" w:name="deploy-en-la-vm"/>
     <w:p>
       <w:pPr>
         <w:pStyle w:val="Heading1"/>
       </w:pPr>
+      <w:bookmarkStart w:id="53" w:name="deploy-en-la-vm"/>
       <w:r>
         <w:t xml:space="preserve">12. Deploy en la VM</w:t>
       </w:r>
+      <w:bookmarkEnd w:id="53"/>
     </w:p>
     <w:p>
       <w:pPr>
@@ -8694,22 +8651,128 @@
         <w:t xml:space="preserve">.</w:t>
       </w:r>
     </w:p>
-    <w:bookmarkEnd w:id="53"/>
-    <w:bookmarkStart w:id="54" w:name="decisiones-tomadas"/>
+    <w:p>
+      <w:pPr>
+        <w:pStyle w:val="BodyText"/>
+      </w:pPr>
+      <w:r>
+        <w:t xml:space="preserve">El script se ejecuta en primer plano (</w:t>
+      </w:r>
+      <w:r>
+        <w:rPr>
+          <w:rStyle w:val="VerbatimChar"/>
+        </w:rPr>
+        <w:t xml:space="preserve">~/infra/deploy.sh</w:t>
+      </w:r>
+      <w:r>
+        <w:t xml:space="preserve">, sin</w:t>
+      </w:r>
+      <w:r>
+        <w:t xml:space="preserve"> </w:t>
+      </w:r>
+      <w:r>
+        <w:rPr>
+          <w:rStyle w:val="VerbatimChar"/>
+        </w:rPr>
+        <w:t xml:space="preserve">&amp;</w:t>
+      </w:r>
+      <w:r>
+        <w:t xml:space="preserve"> </w:t>
+      </w:r>
+      <w:r>
+        <w:t xml:space="preserve">ni</w:t>
+      </w:r>
+      <w:r>
+        <w:t xml:space="preserve"> </w:t>
+      </w:r>
+      <w:r>
+        <w:rPr>
+          <w:rStyle w:val="VerbatimChar"/>
+        </w:rPr>
+        <w:t xml:space="preserve">nohup</w:t>
+      </w:r>
+      <w:r>
+        <w:t xml:space="preserve">), porque al principio</w:t>
+      </w:r>
+      <w:r>
+        <w:t xml:space="preserve"> </w:t>
+      </w:r>
+      <w:r>
+        <w:t xml:space="preserve">pide la contraseña de</w:t>
+      </w:r>
+      <w:r>
+        <w:t xml:space="preserve"> </w:t>
+      </w:r>
+      <w:r>
+        <w:rPr>
+          <w:rStyle w:val="VerbatimChar"/>
+        </w:rPr>
+        <w:t xml:space="preserve">sudo</w:t>
+      </w:r>
+      <w:r>
+        <w:t xml:space="preserve"> </w:t>
+      </w:r>
+      <w:r>
+        <w:t xml:space="preserve">con</w:t>
+      </w:r>
+      <w:r>
+        <w:t xml:space="preserve"> </w:t>
+      </w:r>
+      <w:r>
+        <w:rPr>
+          <w:rStyle w:val="VerbatimChar"/>
+        </w:rPr>
+        <w:t xml:space="preserve">sudo -v</w:t>
+      </w:r>
+      <w:r>
+        <w:t xml:space="preserve">. Si se ejecuta en segundo plano,</w:t>
+      </w:r>
+      <w:r>
+        <w:t xml:space="preserve"> </w:t>
+      </w:r>
+      <w:r>
+        <w:rPr>
+          <w:rStyle w:val="VerbatimChar"/>
+        </w:rPr>
+        <w:t xml:space="preserve">sudo</w:t>
+      </w:r>
+      <w:r>
+        <w:t xml:space="preserve"> </w:t>
+      </w:r>
+      <w:r>
+        <w:t xml:space="preserve">no puede leer la</w:t>
+      </w:r>
+      <w:r>
+        <w:t xml:space="preserve"> </w:t>
+      </w:r>
+      <w:r>
+        <w:t xml:space="preserve">contraseña desde la terminal y el proceso queda detenido (</w:t>
+      </w:r>
+      <w:r>
+        <w:rPr>
+          <w:rStyle w:val="VerbatimChar"/>
+        </w:rPr>
+        <w:t xml:space="preserve">Stopped</w:t>
+      </w:r>
+      <w:r>
+        <w:t xml:space="preserve">).</w:t>
+      </w:r>
+    </w:p>
     <w:p>
       <w:pPr>
         <w:pStyle w:val="Heading1"/>
       </w:pPr>
+      <w:bookmarkStart w:id="54" w:name="decisiones-tomadas"/>
       <w:r>
         <w:t xml:space="preserve">13. Decisiones tomadas</w:t>
       </w:r>
+      <w:bookmarkEnd w:id="54"/>
     </w:p>
     <w:tbl>
       <w:tblPr>
         <w:tblStyle w:val="Table"/>
-        <w:tblW w:type="pct" w:w="5000"/>
-        <w:tblLook w:firstRow="1" w:lastRow="0" w:firstColumn="0" w:lastColumn="0" w:noHBand="0" w:noVBand="0" w:val="0020"/>
-        <w:jc w:val="start"/>
+        <w:tblW w:type="pct" w:w="5000.0"/>
+        <w:tblLook w:firstRow="1"/>
       </w:tblPr>
       <w:tblGrid>
         <w:gridCol w:w="3009"/>
@@ -8718,10 +8781,15 @@
       </w:tblGrid>
       <w:tr>
         <w:trPr>
-          <w:tblHeader w:val="true"/>
+          <w:cnfStyle w:firstRow="1"/>
         </w:trPr>
         <w:tc>
-          <w:tcPr/>
+          <w:tcPr>
+            <w:tcBorders>
+              <w:bottom w:val="single"/>
+            </w:tcBorders>
+            <w:vAlign w:val="bottom"/>
+          </w:tcPr>
           <w:p>
             <w:pPr>
               <w:pStyle w:val="Compact"/>
@@ -8733,7 +8801,12 @@
           </w:p>
         </w:tc>
         <w:tc>
-          <w:tcPr/>
+          <w:tcPr>
+            <w:tcBorders>
+              <w:bottom w:val="single"/>
+            </w:tcBorders>
+            <w:vAlign w:val="bottom"/>
+          </w:tcPr>
           <w:p>
             <w:pPr>
               <w:pStyle w:val="Compact"/>
@@ -8745,7 +8818,12 @@
           </w:p>
         </w:tc>
         <w:tc>
-          <w:tcPr/>
+          <w:tcPr>
+            <w:tcBorders>
+              <w:bottom w:val="single"/>
+            </w:tcBorders>
+            <w:vAlign w:val="bottom"/>
+          </w:tcPr>
           <w:p>
             <w:pPr>
               <w:pStyle w:val="Compact"/>
@@ -8759,7 +8837,6 @@
       </w:tr>
       <w:tr>
         <w:tc>
-          <w:tcPr/>
           <w:p>
             <w:pPr>
               <w:pStyle w:val="Compact"/>
@@ -8771,7 +8848,6 @@
           </w:p>
         </w:tc>
         <w:tc>
-          <w:tcPr/>
           <w:p>
             <w:pPr>
               <w:pStyle w:val="Compact"/>
@@ -8783,7 +8859,6 @@
           </w:p>
         </w:tc>
         <w:tc>
-          <w:tcPr/>
           <w:p>
             <w:pPr>
               <w:pStyle w:val="Compact"/>
@@ -8797,7 +8872,6 @@
       </w:tr>
       <w:tr>
         <w:tc>
-          <w:tcPr/>
           <w:p>
             <w:pPr>
               <w:pStyle w:val="Compact"/>
@@ -8824,7 +8898,6 @@
           </w:p>
         </w:tc>
         <w:tc>
-          <w:tcPr/>
           <w:p>
             <w:pPr>
               <w:pStyle w:val="Compact"/>
@@ -8851,7 +8924,6 @@
           </w:p>
         </w:tc>
         <w:tc>
-          <w:tcPr/>
           <w:p>
             <w:pPr>
               <w:pStyle w:val="Compact"/>
@@ -8865,7 +8937,6 @@
       </w:tr>
       <w:tr>
         <w:tc>
-          <w:tcPr/>
           <w:p>
             <w:pPr>
               <w:pStyle w:val="Compact"/>
@@ -8892,7 +8963,6 @@
           </w:p>
         </w:tc>
         <w:tc>
-          <w:tcPr/>
           <w:p>
             <w:pPr>
               <w:pStyle w:val="Compact"/>
@@ -8904,7 +8974,6 @@
           </w:p>
         </w:tc>
         <w:tc>
-          <w:tcPr/>
           <w:p>
             <w:pPr>
               <w:pStyle w:val="Compact"/>
@@ -8927,7 +8996,6 @@
       </w:tr>
       <w:tr>
         <w:tc>
-          <w:tcPr/>
           <w:p>
             <w:pPr>
               <w:pStyle w:val="Compact"/>
@@ -8963,7 +9031,6 @@
           </w:p>
         </w:tc>
         <w:tc>
-          <w:tcPr/>
           <w:p>
             <w:pPr>
               <w:pStyle w:val="Compact"/>
@@ -8975,7 +9042,6 @@
           </w:p>
         </w:tc>
         <w:tc>
-          <w:tcPr/>
           <w:p>
             <w:pPr>
               <w:pStyle w:val="Compact"/>
@@ -8989,7 +9055,6 @@
       </w:tr>
       <w:tr>
         <w:tc>
-          <w:tcPr/>
           <w:p>
             <w:pPr>
               <w:pStyle w:val="Compact"/>
@@ -9001,7 +9066,6 @@
           </w:p>
         </w:tc>
         <w:tc>
-          <w:tcPr/>
           <w:p>
             <w:pPr>
               <w:pStyle w:val="Compact"/>
@@ -9013,7 +9077,6 @@
           </w:p>
         </w:tc>
         <w:tc>
-          <w:tcPr/>
           <w:p>
             <w:pPr>
               <w:pStyle w:val="Compact"/>
@@ -9039,7 +9102,6 @@
       </w:tr>
       <w:tr>
         <w:tc>
-          <w:tcPr/>
           <w:p>
             <w:pPr>
               <w:pStyle w:val="Compact"/>
@@ -9051,7 +9113,6 @@
           </w:p>
         </w:tc>
         <w:tc>
-          <w:tcPr/>
           <w:p>
             <w:pPr>
               <w:pStyle w:val="Compact"/>
@@ -9063,7 +9124,6 @@
           </w:p>
         </w:tc>
         <w:tc>
-          <w:tcPr/>
           <w:p>
             <w:pPr>
               <w:pStyle w:val="Compact"/>
@@ -9077,7 +9137,6 @@
       </w:tr>
       <w:tr>
         <w:tc>
-          <w:tcPr/>
           <w:p>
             <w:pPr>
               <w:pStyle w:val="Compact"/>
@@ -9089,7 +9148,6 @@
           </w:p>
         </w:tc>
         <w:tc>
-          <w:tcPr/>
           <w:p>
             <w:pPr>
               <w:pStyle w:val="Compact"/>
@@ -9101,7 +9159,6 @@
           </w:p>
         </w:tc>
         <w:tc>
-          <w:tcPr/>
           <w:p>
             <w:pPr>
               <w:pStyle w:val="Compact"/>
@@ -9115,7 +9172,6 @@
       </w:tr>
       <w:tr>
         <w:tc>
-          <w:tcPr/>
           <w:p>
             <w:pPr>
               <w:pStyle w:val="Compact"/>
@@ -9127,7 +9183,6 @@
           </w:p>
         </w:tc>
         <w:tc>
-          <w:tcPr/>
           <w:p>
             <w:pPr>
               <w:pStyle w:val="Compact"/>
@@ -9139,7 +9194,6 @@
           </w:p>
         </w:tc>
         <w:tc>
-          <w:tcPr/>
           <w:p>
             <w:pPr>
               <w:pStyle w:val="Compact"/>
@@ -9153,7 +9207,6 @@
       </w:tr>
       <w:tr>
         <w:tc>
-          <w:tcPr/>
           <w:p>
             <w:pPr>
               <w:pStyle w:val="Compact"/>
@@ -9165,7 +9218,6 @@
           </w:p>
         </w:tc>
         <w:tc>
-          <w:tcPr/>
           <w:p>
             <w:pPr>
               <w:pStyle w:val="Compact"/>
@@ -9177,7 +9229,6 @@
           </w:p>
         </w:tc>
         <w:tc>
-          <w:tcPr/>
           <w:p>
             <w:pPr>
               <w:pStyle w:val="Compact"/>
@@ -9191,7 +9242,6 @@
       </w:tr>
       <w:tr>
         <w:tc>
-          <w:tcPr/>
           <w:p>
             <w:pPr>
               <w:pStyle w:val="Compact"/>
@@ -9203,7 +9253,6 @@
           </w:p>
         </w:tc>
         <w:tc>
-          <w:tcPr/>
           <w:p>
             <w:pPr>
               <w:pStyle w:val="Compact"/>
@@ -9215,7 +9264,6 @@
           </w:p>
         </w:tc>
         <w:tc>
-          <w:tcPr/>
           <w:p>
             <w:pPr>
               <w:pStyle w:val="Compact"/>
@@ -9229,7 +9277,6 @@
       </w:tr>
       <w:tr>
         <w:tc>
-          <w:tcPr/>
           <w:p>
             <w:pPr>
               <w:pStyle w:val="Compact"/>
@@ -9241,7 +9288,6 @@
           </w:p>
         </w:tc>
         <w:tc>
-          <w:tcPr/>
           <w:p>
             <w:pPr>
               <w:pStyle w:val="Compact"/>
@@ -9253,7 +9299,6 @@
           </w:p>
         </w:tc>
         <w:tc>
-          <w:tcPr/>
           <w:p>
             <w:pPr>
               <w:pStyle w:val="Compact"/>
@@ -9267,7 +9312,6 @@
       </w:tr>
       <w:tr>
         <w:tc>
-          <w:tcPr/>
           <w:p>
             <w:pPr>
               <w:pStyle w:val="Compact"/>
@@ -9279,7 +9323,6 @@
           </w:p>
         </w:tc>
         <w:tc>
-          <w:tcPr/>
           <w:p>
             <w:pPr>
               <w:pStyle w:val="Compact"/>
@@ -9291,7 +9334,6 @@
           </w:p>
         </w:tc>
         <w:tc>
-          <w:tcPr/>
           <w:p>
             <w:pPr>
               <w:pStyle w:val="Compact"/>
@@ -9305,7 +9347,6 @@
       </w:tr>
       <w:tr>
         <w:tc>
-          <w:tcPr/>
           <w:p>
             <w:pPr>
               <w:pStyle w:val="Compact"/>
@@ -9317,7 +9358,6 @@
           </w:p>
         </w:tc>
         <w:tc>
-          <w:tcPr/>
           <w:p>
             <w:pPr>
               <w:pStyle w:val="Compact"/>
@@ -9329,7 +9369,6 @@
           </w:p>
         </w:tc>
         <w:tc>
-          <w:tcPr/>
           <w:p>
             <w:pPr>
               <w:pStyle w:val="Compact"/>
@@ -9343,7 +9382,6 @@
       </w:tr>
       <w:tr>
         <w:tc>
-          <w:tcPr/>
           <w:p>
             <w:pPr>
               <w:pStyle w:val="Compact"/>
@@ -9355,7 +9393,6 @@
           </w:p>
         </w:tc>
         <w:tc>
-          <w:tcPr/>
           <w:p>
             <w:pPr>
               <w:pStyle w:val="Compact"/>
@@ -9367,7 +9404,6 @@
           </w:p>
         </w:tc>
         <w:tc>
-          <w:tcPr/>
           <w:p>
             <w:pPr>
               <w:pStyle w:val="Compact"/>
@@ -9392,15 +9428,15 @@
         </w:tc>
       </w:tr>
     </w:tbl>
-    <w:bookmarkEnd w:id="54"/>
-    <w:bookmarkStart w:id="55" w:name="preguntas-para-practicar-la-defensa"/>
     <w:p>
       <w:pPr>
         <w:pStyle w:val="Heading1"/>
       </w:pPr>
+      <w:bookmarkStart w:id="55" w:name="preguntas-para-practicar-la-defensa"/>
       <w:r>
         <w:t xml:space="preserve">14. Preguntas para practicar la defensa</w:t>
       </w:r>
+      <w:bookmarkEnd w:id="55"/>
     </w:p>
     <w:p>
       <w:pPr>
@@ -9408,7 +9444,6 @@
       </w:pPr>
       <w:r>
         <w:rPr>
-          <w:bCs/>
           <w:b/>
         </w:rPr>
         <w:t xml:space="preserve">¿Qué pasa si llega un dato de carga para una orden cerrada?</w:t>
@@ -9474,7 +9509,6 @@
       </w:pPr>
       <w:r>
         <w:rPr>
-          <w:bCs/>
           <w:b/>
         </w:rPr>
         <w:t xml:space="preserve">¿Cómo se evita que una orden vuelva a un estado anterior?</w:t>
@@ -9516,7 +9550,6 @@
       </w:pPr>
       <w:r>
         <w:rPr>
-          <w:bCs/>
           <w:b/>
         </w:rPr>
         <w:t xml:space="preserve">¿Dónde se ve quién cambió el estado?</w:t>
@@ -9579,7 +9612,6 @@
       </w:pPr>
       <w:r>
         <w:rPr>
-          <w:bCs/>
           <w:b/>
         </w:rPr>
         <w:t xml:space="preserve">Si llegan datos cada segundo, ¿cuántos se guardan?</w:t>
@@ -9633,7 +9665,6 @@
       </w:pPr>
       <w:r>
         <w:rPr>
-          <w:bCs/>
           <w:b/>
         </w:rPr>
         <w:t xml:space="preserve">¿Cómo se calcula el promedio de temperatura?</w:t>
@@ -9675,7 +9706,6 @@
       </w:pPr>
       <w:r>
         <w:rPr>
-          <w:bCs/>
           <w:b/>
         </w:rPr>
         <w:t xml:space="preserve">¿Qué pasa si SAP manda un camión que ya existe con otra patente?</w:t>
@@ -9720,7 +9750,6 @@
       </w:pPr>
       <w:r>
         <w:rPr>
-          <w:bCs/>
           <w:b/>
         </w:rPr>
         <w:t xml:space="preserve">¿Por qué la password no aparece al consultar la orden?</w:t>
@@ -9750,14 +9779,12 @@
       </w:pPr>
       <w:r>
         <w:rPr>
-          <w:bCs/>
           <w:b/>
         </w:rPr>
         <w:t xml:space="preserve">¿Qué pasa si el usuario</w:t>
       </w:r>
       <w:r>
         <w:rPr>
-          <w:bCs/>
           <w:b/>
         </w:rPr>
         <w:t xml:space="preserve"> </w:t>
@@ -9765,21 +9792,18 @@
       <w:r>
         <w:rPr>
           <w:rStyle w:val="VerbatimChar"/>
-          <w:bCs/>
           <w:b/>
         </w:rPr>
         <w:t xml:space="preserve">sap</w:t>
       </w:r>
       <w:r>
         <w:rPr>
-          <w:bCs/>
           <w:b/>
         </w:rPr>
         <w:t xml:space="preserve"> </w:t>
       </w:r>
       <w:r>
         <w:rPr>
-          <w:bCs/>
           <w:b/>
         </w:rPr>
         <w:t xml:space="preserve">intenta registrar un pesaje?</w:t>
@@ -9830,14 +9854,12 @@
       </w:pPr>
       <w:r>
         <w:rPr>
-          <w:bCs/>
           <w:b/>
         </w:rPr>
         <w:t xml:space="preserve">¿Por qué los pesos son</w:t>
       </w:r>
       <w:r>
         <w:rPr>
-          <w:bCs/>
           <w:b/>
         </w:rPr>
         <w:t xml:space="preserve"> </w:t>
@@ -9845,28 +9867,24 @@
       <w:r>
         <w:rPr>
           <w:rStyle w:val="VerbatimChar"/>
-          <w:bCs/>
           <w:b/>
         </w:rPr>
         <w:t xml:space="preserve">Double</w:t>
       </w:r>
       <w:r>
         <w:rPr>
-          <w:bCs/>
           <w:b/>
         </w:rPr>
         <w:t xml:space="preserve"> </w:t>
       </w:r>
       <w:r>
         <w:rPr>
-          <w:bCs/>
           <w:b/>
         </w:rPr>
         <w:t xml:space="preserve">y no</w:t>
       </w:r>
       <w:r>
         <w:rPr>
-          <w:bCs/>
           <w:b/>
         </w:rPr>
         <w:t xml:space="preserve"> </w:t>
@@ -9874,14 +9892,12 @@
       <w:r>
         <w:rPr>
           <w:rStyle w:val="VerbatimChar"/>
-          <w:bCs/>
           <w:b/>
         </w:rPr>
         <w:t xml:space="preserve">double</w:t>
       </w:r>
       <w:r>
         <w:rPr>
-          <w:bCs/>
           <w:b/>
         </w:rPr>
         <w:t xml:space="preserve">?</w:t>
@@ -9959,7 +9975,6 @@
       </w:pPr>
       <w:r>
         <w:rPr>
-          <w:bCs/>
           <w:b/>
         </w:rPr>
         <w:t xml:space="preserve">¿Cómo se genera la password?</w:t>
@@ -9998,15 +10013,15 @@
         <w:t xml:space="preserve">multiplicado por 90000 da entre 0 y 89999, y sumando 10000 queda entre 10000 y 99999.</w:t>
       </w:r>
     </w:p>
-    <w:bookmarkEnd w:id="55"/>
-    <w:bookmarkStart w:id="56" w:name="registro-de-cambios"/>
     <w:p>
       <w:pPr>
         <w:pStyle w:val="Heading1"/>
       </w:pPr>
+      <w:bookmarkStart w:id="56" w:name="registro-de-cambios"/>
       <w:r>
         <w:t xml:space="preserve">15. Registro de cambios</w:t>
       </w:r>
+      <w:bookmarkEnd w:id="56"/>
     </w:p>
     <w:p>
       <w:pPr>
@@ -10031,9 +10046,8 @@
     <w:tbl>
       <w:tblPr>
         <w:tblStyle w:val="Table"/>
-        <w:tblW w:type="pct" w:w="5000"/>
-        <w:tblLook w:firstRow="1" w:lastRow="0" w:firstColumn="0" w:lastColumn="0" w:noHBand="0" w:noVBand="0" w:val="0020"/>
-        <w:jc w:val="start"/>
+        <w:tblW w:type="pct" w:w="5000.0"/>
+        <w:tblLook w:firstRow="1"/>
       </w:tblPr>
       <w:tblGrid>
         <w:gridCol w:w="1131"/>
@@ -10041,10 +10055,15 @@
       </w:tblGrid>
       <w:tr>
         <w:trPr>
-          <w:tblHeader w:val="true"/>
+          <w:cnfStyle w:firstRow="1"/>
         </w:trPr>
         <w:tc>
-          <w:tcPr/>
+          <w:tcPr>
+            <w:tcBorders>
+              <w:bottom w:val="single"/>
+            </w:tcBorders>
+            <w:vAlign w:val="bottom"/>
+          </w:tcPr>
           <w:p>
             <w:pPr>
               <w:pStyle w:val="Compact"/>
@@ -10056,7 +10075,12 @@
           </w:p>
         </w:tc>
         <w:tc>
-          <w:tcPr/>
+          <w:tcPr>
+            <w:tcBorders>
+              <w:bottom w:val="single"/>
+            </w:tcBorders>
+            <w:vAlign w:val="bottom"/>
+          </w:tcPr>
           <w:p>
             <w:pPr>
               <w:pStyle w:val="Compact"/>
@@ -10070,7 +10094,6 @@
       </w:tr>
       <w:tr>
         <w:tc>
-          <w:tcPr/>
           <w:p>
             <w:pPr>
               <w:pStyle w:val="Compact"/>
@@ -10082,7 +10105,6 @@
           </w:p>
         </w:tc>
         <w:tc>
-          <w:tcPr/>
           <w:p>
             <w:pPr>
               <w:pStyle w:val="Compact"/>
@@ -10095,7 +10117,6 @@
         </w:tc>
       </w:tr>
     </w:tbl>
-    <w:bookmarkEnd w:id="56"/>
     <w:sectPr/>
   </w:body>
 </w:document>
@@ -10127,14 +10148,17 @@
 <file path=word/numbering.xml><?xml version="1.0" encoding="utf-8"?>
 <w:numbering xmlns:w="http://schemas.openxmlformats.org/wordprocessingml/2006/main">
   <w:abstractNum w:abstractNumId="990">
-    <w:nsid w:val="A990"/>
+    <w:nsid w:val="2c1ae401"/>
     <w:multiLevelType w:val="multilevel"/>
     <w:lvl w:ilvl="0">
       <w:numFmt w:val="bullet"/>
       <w:lvlText w:val=" "/>
       <w:lvlJc w:val="left"/>
       <w:pPr>
-        <w:ind w:left="720" w:hanging="480"/>
+        <w:tabs>
+          <w:tab w:val="num" w:pos="0"/>
+        </w:tabs>
+        <w:ind w:left="480" w:hanging="480"/>
       </w:pPr>
     </w:lvl>
     <w:lvl w:ilvl="1">
@@ -10142,7 +10166,10 @@
       <w:lvlText w:val=" "/>
       <w:lvlJc w:val="left"/>
       <w:pPr>
-        <w:ind w:left="1440" w:hanging="480"/>
+        <w:tabs>
+          <w:tab w:val="num" w:pos="720"/>
+        </w:tabs>
+        <w:ind w:left="1200" w:hanging="480"/>
       </w:pPr>
     </w:lvl>
     <w:lvl w:ilvl="2">
@@ -10150,7 +10177,10 @@
       <w:lvlText w:val=" "/>
       <w:lvlJc w:val="left"/>
       <w:pPr>
-        <w:ind w:left="2160" w:hanging="480"/>
+        <w:tabs>
+          <w:tab w:val="num" w:pos="1440"/>
+        </w:tabs>
+        <w:ind w:left="1920" w:hanging="480"/>
       </w:pPr>
     </w:lvl>
     <w:lvl w:ilvl="3">
@@ -10158,7 +10188,10 @@
       <w:lvlText w:val=" "/>
       <w:lvlJc w:val="left"/>
       <w:pPr>
-        <w:ind w:left="2880" w:hanging="480"/>
+        <w:tabs>
+          <w:tab w:val="num" w:pos="2160"/>
+        </w:tabs>
+        <w:ind w:left="2640" w:hanging="480"/>
       </w:pPr>
     </w:lvl>
     <w:lvl w:ilvl="4">
@@ -10166,7 +10199,10 @@
       <w:lvlText w:val=" "/>
       <w:lvlJc w:val="left"/>
       <w:pPr>
-        <w:ind w:left="3600" w:hanging="480"/>
+        <w:tabs>
+          <w:tab w:val="num" w:pos="2880"/>
+        </w:tabs>
+        <w:ind w:left="3360" w:hanging="480"/>
       </w:pPr>
     </w:lvl>
     <w:lvl w:ilvl="5">
@@ -10174,7 +10210,10 @@
       <w:lvlText w:val=" "/>
       <w:lvlJc w:val="left"/>
       <w:pPr>
-        <w:ind w:left="4320" w:hanging="480"/>
+        <w:tabs>
+          <w:tab w:val="num" w:pos="3600"/>
+        </w:tabs>
+        <w:ind w:left="4080" w:hanging="480"/>
       </w:pPr>
     </w:lvl>
     <w:lvl w:ilvl="6">
@@ -10182,7 +10221,10 @@
       <w:lvlText w:val=" "/>
       <w:lvlJc w:val="left"/>
       <w:pPr>
-        <w:ind w:left="5040" w:hanging="480"/>
+        <w:tabs>
+          <w:tab w:val="num" w:pos="4320"/>
+        </w:tabs>
+        <w:ind w:left="4800" w:hanging="480"/>
       </w:pPr>
     </w:lvl>
     <w:lvl w:ilvl="7">
@@ -10190,7 +10232,10 @@
       <w:lvlText w:val=" "/>
       <w:lvlJc w:val="left"/>
       <w:pPr>
-        <w:ind w:left="5760" w:hanging="480"/>
+        <w:tabs>
+          <w:tab w:val="num" w:pos="5040"/>
+        </w:tabs>
+        <w:ind w:left="5520" w:hanging="480"/>
       </w:pPr>
     </w:lvl>
     <w:lvl w:ilvl="8">
@@ -10198,12 +10243,15 @@
       <w:lvlText w:val=" "/>
       <w:lvlJc w:val="left"/>
       <w:pPr>
-        <w:ind w:left="6480" w:hanging="480"/>
+        <w:tabs>
+          <w:tab w:val="num" w:pos="5760"/>
+        </w:tabs>
+        <w:ind w:left="6240" w:hanging="480"/>
       </w:pPr>
     </w:lvl>
   </w:abstractNum>
   <w:abstractNum w:abstractNumId="99411">
-    <w:nsid w:val="A99411"/>
+    <w:nsid w:val="ea454b4c"/>
     <w:multiLevelType w:val="multilevel"/>
     <w:lvl w:ilvl="0">
       <w:start w:val="1"/>
@@ -10211,7 +10259,10 @@
       <w:lvlText w:val="%1."/>
       <w:lvlJc w:val="left"/>
       <w:pPr>
-        <w:ind w:left="720" w:hanging="480"/>
+        <w:tabs>
+          <w:tab w:val="num" w:pos="0"/>
+        </w:tabs>
+        <w:ind w:left="480" w:hanging="480"/>
       </w:pPr>
     </w:lvl>
     <w:lvl w:ilvl="1">
@@ -10220,7 +10271,10 @@
       <w:lvlText w:val="%2."/>
       <w:lvlJc w:val="left"/>
       <w:pPr>
-        <w:ind w:left="1440" w:hanging="480"/>
+        <w:tabs>
+          <w:tab w:val="num" w:pos="720"/>
+        </w:tabs>
+        <w:ind w:left="1200" w:hanging="480"/>
       </w:pPr>
     </w:lvl>
     <w:lvl w:ilvl="2">
@@ -10229,7 +10283,10 @@
       <w:lvlText w:val="%3."/>
       <w:lvlJc w:val="left"/>
       <w:pPr>
-        <w:ind w:left="2160" w:hanging="480"/>
+        <w:tabs>
+          <w:tab w:val="num" w:pos="1440"/>
+        </w:tabs>
+        <w:ind w:left="1920" w:hanging="480"/>
       </w:pPr>
     </w:lvl>
     <w:lvl w:ilvl="3">
@@ -10238,7 +10295,10 @@
       <w:lvlText w:val="%4."/>
       <w:lvlJc w:val="left"/>
       <w:pPr>
-        <w:ind w:left="2880" w:hanging="480"/>
+        <w:tabs>
+          <w:tab w:val="num" w:pos="2160"/>
+        </w:tabs>
+        <w:ind w:left="2640" w:hanging="480"/>
       </w:pPr>
     </w:lvl>
     <w:lvl w:ilvl="4">
@@ -10247,7 +10307,10 @@
       <w:lvlText w:val="%5."/>
       <w:lvlJc w:val="left"/>
       <w:pPr>
-        <w:ind w:left="3600" w:hanging="480"/>
+        <w:tabs>
+          <w:tab w:val="num" w:pos="2880"/>
+        </w:tabs>
+        <w:ind w:left="3360" w:hanging="480"/>
       </w:pPr>
     </w:lvl>
     <w:lvl w:ilvl="5">
@@ -10256,7 +10319,10 @@
       <w:lvlText w:val="%6."/>
       <w:lvlJc w:val="left"/>
       <w:pPr>
-        <w:ind w:left="4320" w:hanging="480"/>
+        <w:tabs>
+          <w:tab w:val="num" w:pos="3600"/>
+        </w:tabs>
+        <w:ind w:left="4080" w:hanging="480"/>
       </w:pPr>
     </w:lvl>
     <w:lvl w:ilvl="6">
@@ -10265,7 +10331,10 @@
       <w:lvlText w:val="%7."/>
       <w:lvlJc w:val="left"/>
       <w:pPr>
-        <w:ind w:left="5040" w:hanging="480"/>
+        <w:tabs>
+          <w:tab w:val="num" w:pos="4320"/>
+        </w:tabs>
+        <w:ind w:left="4800" w:hanging="480"/>
       </w:pPr>
     </w:lvl>
     <w:lvl w:ilvl="7">
@@ -10274,7 +10343,10 @@
       <w:lvlText w:val="%8."/>
       <w:lvlJc w:val="left"/>
       <w:pPr>
-        <w:ind w:left="5760" w:hanging="480"/>
+        <w:tabs>
+          <w:tab w:val="num" w:pos="5040"/>
+        </w:tabs>
+        <w:ind w:left="5520" w:hanging="480"/>
       </w:pPr>
     </w:lvl>
     <w:lvl w:ilvl="8">
@@ -10283,19 +10355,25 @@
       <w:lvlText w:val="%9."/>
       <w:lvlJc w:val="left"/>
       <w:pPr>
-        <w:ind w:left="6480" w:hanging="480"/>
+        <w:tabs>
+          <w:tab w:val="num" w:pos="5760"/>
+        </w:tabs>
+        <w:ind w:left="6240" w:hanging="480"/>
       </w:pPr>
     </w:lvl>
   </w:abstractNum>
   <w:abstractNum w:abstractNumId="991">
-    <w:nsid w:val="A991"/>
+    <w:nsid w:val="71315dca"/>
     <w:multiLevelType w:val="multilevel"/>
     <w:lvl w:ilvl="0">
       <w:numFmt w:val="bullet"/>
       <w:lvlText w:val="•"/>
       <w:lvlJc w:val="left"/>
       <w:pPr>
-        <w:ind w:left="720" w:hanging="480"/>
+        <w:tabs>
+          <w:tab w:val="num" w:pos="0"/>
+        </w:tabs>
+        <w:ind w:left="480" w:hanging="480"/>
       </w:pPr>
     </w:lvl>
     <w:lvl w:ilvl="1">
@@ -10303,7 +10381,10 @@
       <w:lvlText w:val="–"/>
       <w:lvlJc w:val="left"/>
       <w:pPr>
-        <w:ind w:left="1440" w:hanging="480"/>
+        <w:tabs>
+          <w:tab w:val="num" w:pos="720"/>
+        </w:tabs>
+        <w:ind w:left="1200" w:hanging="480"/>
       </w:pPr>
     </w:lvl>
     <w:lvl w:ilvl="2">
@@ -10311,7 +10392,10 @@
       <w:lvlText w:val="•"/>
       <w:lvlJc w:val="left"/>
       <w:pPr>
-        <w:ind w:left="2160" w:hanging="480"/>
+        <w:tabs>
+          <w:tab w:val="num" w:pos="1440"/>
+        </w:tabs>
+        <w:ind w:left="1920" w:hanging="480"/>
       </w:pPr>
     </w:lvl>
     <w:lvl w:ilvl="3">
@@ -10319,7 +10403,10 @@
       <w:lvlText w:val="–"/>
       <w:lvlJc w:val="left"/>
       <w:pPr>
-        <w:ind w:left="2880" w:hanging="480"/>
+        <w:tabs>
+          <w:tab w:val="num" w:pos="2160"/>
+        </w:tabs>
+        <w:ind w:left="2640" w:hanging="480"/>
       </w:pPr>
     </w:lvl>
     <w:lvl w:ilvl="4">
@@ -10327,7 +10414,10 @@
       <w:lvlText w:val="•"/>
       <w:lvlJc w:val="left"/>
       <w:pPr>
-        <w:ind w:left="3600" w:hanging="480"/>
+        <w:tabs>
+          <w:tab w:val="num" w:pos="2880"/>
+        </w:tabs>
+        <w:ind w:left="3360" w:hanging="480"/>
       </w:pPr>
     </w:lvl>
     <w:lvl w:ilvl="5">
@@ -10335,7 +10425,10 @@
       <w:lvlText w:val="–"/>
       <w:lvlJc w:val="left"/>
       <w:pPr>
-        <w:ind w:left="4320" w:hanging="480"/>
+        <w:tabs>
+          <w:tab w:val="num" w:pos="3600"/>
+        </w:tabs>
+        <w:ind w:left="4080" w:hanging="480"/>
       </w:pPr>
     </w:lvl>
     <w:lvl w:ilvl="6">
@@ -10343,7 +10436,10 @@
       <w:lvlText w:val="•"/>
       <w:lvlJc w:val="left"/>
       <w:pPr>
-        <w:ind w:left="5040" w:hanging="480"/>
+        <w:tabs>
+          <w:tab w:val="num" w:pos="4320"/>
+        </w:tabs>
+        <w:ind w:left="4800" w:hanging="480"/>
       </w:pPr>
     </w:lvl>
     <w:lvl w:ilvl="7">
@@ -10351,7 +10447,10 @@
       <w:lvlText w:val="–"/>
       <w:lvlJc w:val="left"/>
       <w:pPr>
-        <w:ind w:left="5760" w:hanging="480"/>
+        <w:tabs>
+          <w:tab w:val="num" w:pos="5040"/>
+        </w:tabs>
+        <w:ind w:left="5520" w:hanging="480"/>
       </w:pPr>
     </w:lvl>
     <w:lvl w:ilvl="8">
@@ -10359,7 +10458,10 @@
       <w:lvlText w:val="•"/>
       <w:lvlJc w:val="left"/>
       <w:pPr>
-        <w:ind w:left="6480" w:hanging="480"/>
+        <w:tabs>
+          <w:tab w:val="num" w:pos="5760"/>
+        </w:tabs>
+        <w:ind w:left="6240" w:hanging="480"/>
       </w:pPr>
     </w:lvl>
   </w:abstractNum>
@@ -10572,10 +10674,10 @@
   <w:docDefaults>
     <w:rPrDefault>
       <w:rPr>
-        <w:rFonts w:ascii="Calibri" w:cs="Calibri" w:eastAsia="Calibri" w:hAnsi="Calibri"/>
+        <w:rFonts w:ascii="Calibri" w:hAnsi="Calibri" w:eastAsia="Calibri" w:cs="Calibri"/>
         <w:sz w:val="24"/>
         <w:szCs w:val="24"/>
-        <w:lang w:bidi="ar-SA" w:eastAsia="en-US" w:val="es"/>
+        <w:lang w:val="es" w:eastAsia="en-US" w:bidi="ar-SA"/>
       </w:rPr>
     </w:rPrDefault>
     <w:pPrDefault>
@@ -10584,35 +10686,35 @@
       </w:pPr>
     </w:pPrDefault>
   </w:docDefaults>
-  <w:latentStyles w:count="276" w:defLockedState="0" w:defQFormat="0" w:defSemiHidden="0" w:defUIPriority="0" w:defUnhideWhenUsed="0"/>
-  <w:style w:default="1" w:styleId="Normal" w:type="paragraph">
+  <w:latentStyles w:defLockedState="0" w:defUIPriority="0" w:defSemiHidden="0" w:defUnhideWhenUsed="0" w:defQFormat="0" w:count="276"/>
+  <w:style w:type="paragraph" w:default="1" w:styleId="Normal">
     <w:name w:val="Normal"/>
     <w:qFormat/>
   </w:style>
-  <w:style w:styleId="BodyText" w:type="paragraph">
+  <w:style w:type="paragraph" w:styleId="BodyText">
     <w:name w:val="Body Text"/>
     <w:basedOn w:val="Normal"/>
     <w:link w:val="BodyTextChar"/>
     <w:pPr>
-      <w:spacing w:after="180" w:before="180"/>
+      <w:spacing w:before="180" w:after="180"/>
     </w:pPr>
     <w:qFormat/>
   </w:style>
-  <w:style w:customStyle="1" w:styleId="FirstParagraph" w:type="paragraph">
+  <w:style w:type="paragraph" w:customStyle="1" w:styleId="FirstParagraph">
     <w:name w:val="First Paragraph"/>
     <w:basedOn w:val="BodyText"/>
     <w:next w:val="BodyText"/>
     <w:qFormat/>
   </w:style>
-  <w:style w:customStyle="1" w:styleId="Compact" w:type="paragraph">
+  <w:style w:type="paragraph" w:customStyle="1" w:styleId="Compact">
     <w:name w:val="Compact"/>
     <w:basedOn w:val="BodyText"/>
     <w:qFormat/>
     <w:pPr>
-      <w:spacing w:after="36" w:before="36"/>
+      <w:spacing w:before="36" w:after="36"/>
     </w:pPr>
   </w:style>
-  <w:style w:styleId="Title" w:type="paragraph">
+  <w:style w:type="paragraph" w:styleId="Title">
     <w:name w:val="Title"/>
     <w:basedOn w:val="Normal"/>
     <w:next w:val="BodyText"/>
@@ -10620,11 +10722,11 @@
     <w:pPr>
       <w:keepNext/>
       <w:keepLines/>
-      <w:spacing w:after="240" w:before="480"/>
+      <w:spacing w:before="480" w:after="240"/>
       <w:jc w:val="center"/>
     </w:pPr>
     <w:rPr>
-      <w:rFonts w:ascii="Calibri" w:cs="Calibri" w:eastAsia="Calibri" w:hAnsi="Calibri"/>
+      <w:rFonts w:ascii="Calibri" w:hAnsi="Calibri" w:eastAsia="Calibri" w:cs="Calibri"/>
       <w:b/>
       <w:bCs/>
       <w:color w:val="000000"/>
@@ -10632,7 +10734,7 @@
       <w:szCs w:val="36"/>
     </w:rPr>
   </w:style>
-  <w:style w:styleId="Subtitle" w:type="paragraph">
+  <w:style w:type="paragraph" w:styleId="Subtitle">
     <w:name w:val="Subtitle"/>
     <w:basedOn w:val="Title"/>
     <w:next w:val="BodyText"/>
@@ -10640,7 +10742,7 @@
     <w:pPr>
       <w:keepNext/>
       <w:keepLines/>
-      <w:spacing w:after="240" w:before="240"/>
+      <w:spacing w:before="240" w:after="240"/>
       <w:jc w:val="center"/>
     </w:pPr>
     <w:rPr>
@@ -10648,7 +10750,7 @@
       <w:szCs w:val="30"/>
     </w:rPr>
   </w:style>
-  <w:style w:customStyle="1" w:styleId="Author" w:type="paragraph">
+  <w:style w:type="paragraph" w:customStyle="1" w:styleId="Author">
     <w:name w:val="Author"/>
     <w:next w:val="BodyText"/>
     <w:qFormat/>
@@ -10658,7 +10760,7 @@
       <w:jc w:val="center"/>
     </w:pPr>
   </w:style>
-  <w:style w:styleId="Date" w:type="paragraph">
+  <w:style w:type="paragraph" w:styleId="Date">
     <w:name w:val="Date"/>
     <w:next w:val="BodyText"/>
     <w:qFormat/>
@@ -10668,7 +10770,7 @@
       <w:jc w:val="center"/>
     </w:pPr>
   </w:style>
-  <w:style w:customStyle="1" w:styleId="AbstractTitle" w:type="paragraph">
+  <w:style w:type="paragraph" w:customStyle="1" w:styleId="AbstractTitle">
     <w:name w:val="Abstract Title"/>
     <w:basedOn w:val="Normal"/>
     <w:next w:val="Abstract"/>
@@ -10677,7 +10779,7 @@
       <w:keepNext/>
       <w:keepLines/>
       <w:jc w:val="center"/>
-      <w:spacing w:after="0" w:before="300"/>
+      <w:spacing w:before="300" w:after="0"/>
     </w:pPr>
     <w:rPr>
       <w:sz w:val="20"/>
@@ -10687,7 +10789,7 @@
       &gt;
     </w:rPr>
   </w:style>
-  <w:style w:customStyle="1" w:styleId="Abstract" w:type="paragraph">
+  <w:style w:type="paragraph" w:customStyle="1" w:styleId="Abstract">
     <w:name w:val="Abstract"/>
     <w:basedOn w:val="Normal"/>
     <w:next w:val="BodyText"/>
@@ -10695,14 +10797,14 @@
     <w:pPr>
       <w:keepNext/>
       <w:keepLines/>
-      <w:spacing w:after="300" w:before="100"/>
+      <w:spacing w:before="100" w:after="300"/>
     </w:pPr>
     <w:rPr>
       <w:sz w:val="20"/>
       <w:szCs w:val="20"/>
     </w:rPr>
   </w:style>
-  <w:style w:styleId="Bibliography" w:type="paragraph">
+  <w:style w:type="paragraph" w:styleId="Bibliography">
     <w:name w:val="Bibliography"/>
     <w:basedOn w:val="Normal"/>
     <w:next w:val="Bibliography"/>
@@ -10710,7 +10812,7 @@
     <w:pPr/>
     <w:rPr/>
   </w:style>
-  <w:style w:styleId="Heading1" w:type="paragraph">
+  <w:style w:type="paragraph" w:styleId="Heading1">
     <w:name w:val="Heading 1"/>
     <w:basedOn w:val="Normal"/>
     <w:next w:val="BodyText"/>
@@ -10719,11 +10821,11 @@
     <w:pPr>
       <w:keepNext/>
       <w:keepLines/>
-      <w:spacing w:after="0" w:before="480"/>
+      <w:spacing w:before="480" w:after="0"/>
       <w:outlineLvl w:val="0"/>
     </w:pPr>
     <w:rPr>
-      <w:rFonts w:ascii="Calibri" w:cs="Calibri" w:eastAsia="Calibri" w:hAnsi="Calibri"/>
+      <w:rFonts w:ascii="Calibri" w:hAnsi="Calibri" w:eastAsia="Calibri" w:cs="Calibri"/>
       <w:b/>
       <w:bCs/>
       <w:color w:val="000000"/>
@@ -10731,7 +10833,7 @@
       <w:szCs w:val="32"/>
     </w:rPr>
   </w:style>
-  <w:style w:styleId="Heading2" w:type="paragraph">
+  <w:style w:type="paragraph" w:styleId="Heading2">
     <w:name w:val="Heading 2"/>
     <w:basedOn w:val="Normal"/>
     <w:next w:val="BodyText"/>
@@ -10741,11 +10843,11 @@
     <w:pPr>
       <w:keepNext/>
       <w:keepLines/>
-      <w:spacing w:after="0" w:before="200"/>
+      <w:spacing w:before="200" w:after="0"/>
       <w:outlineLvl w:val="1"/>
     </w:pPr>
     <w:rPr>
-      <w:rFonts w:ascii="Calibri" w:cs="Calibri" w:eastAsia="Calibri" w:hAnsi="Calibri"/>
+      <w:rFonts w:ascii="Calibri" w:hAnsi="Calibri" w:eastAsia="Calibri" w:cs="Calibri"/>
       <w:b/>
       <w:bCs/>
       <w:color w:val="000000"/>
@@ -10753,7 +10855,7 @@
       <w:szCs w:val="28"/>
     </w:rPr>
   </w:style>
-  <w:style w:styleId="Heading3" w:type="paragraph">
+  <w:style w:type="paragraph" w:styleId="Heading3">
     <w:name w:val="Heading 3"/>
     <w:basedOn w:val="Normal"/>
     <w:next w:val="BodyText"/>
@@ -10763,11 +10865,11 @@
     <w:pPr>
       <w:keepNext/>
       <w:keepLines/>
-      <w:spacing w:after="0" w:before="200"/>
+      <w:spacing w:before="200" w:after="0"/>
       <w:outlineLvl w:val="2"/>
     </w:pPr>
     <w:rPr>
-      <w:rFonts w:ascii="Calibri" w:cs="Calibri" w:eastAsia="Calibri" w:hAnsi="Calibri"/>
+      <w:rFonts w:ascii="Calibri" w:hAnsi="Calibri" w:eastAsia="Calibri" w:cs="Calibri"/>
       <w:b/>
       <w:bCs/>
       <w:color w:val="000000"/>
@@ -10775,7 +10877,7 @@
       <w:szCs w:val="24"/>
     </w:rPr>
   </w:style>
-  <w:style w:styleId="Heading4" w:type="paragraph">
+  <w:style w:type="paragraph" w:styleId="Heading4">
     <w:name w:val="Heading 4"/>
     <w:basedOn w:val="Normal"/>
     <w:next w:val="BodyText"/>
@@ -10785,11 +10887,11 @@
     <w:pPr>
       <w:keepNext/>
       <w:keepLines/>
-      <w:spacing w:after="0" w:before="200"/>
+      <w:spacing w:before="200" w:after="0"/>
       <w:outlineLvl w:val="3"/>
     </w:pPr>
     <w:rPr>
-      <w:rFonts w:ascii="Calibri" w:cs="Calibri" w:eastAsia="Calibri" w:hAnsi="Calibri"/>
+      <w:rFonts w:ascii="Calibri" w:hAnsi="Calibri" w:eastAsia="Calibri" w:cs="Calibri"/>
       <w:i/>
       <w:bCs/>
       <w:color w:val="000000"/>
@@ -10797,7 +10899,7 @@
       <w:szCs w:val="24"/>
     </w:rPr>
   </w:style>
-  <w:style w:styleId="Heading5" w:type="paragraph">
+  <w:style w:type="paragraph" w:styleId="Heading5">
     <w:name w:val="Heading 5"/>
     <w:basedOn w:val="Normal"/>
     <w:next w:val="BodyText"/>
@@ -10807,18 +10909,18 @@
     <w:pPr>
       <w:keepNext/>
       <w:keepLines/>
-      <w:spacing w:after="0" w:before="200"/>
+      <w:spacing w:before="200" w:after="0"/>
       <w:outlineLvl w:val="4"/>
     </w:pPr>
     <w:rPr>
-      <w:rFonts w:ascii="Calibri" w:cs="Calibri" w:eastAsia="Calibri" w:hAnsi="Calibri"/>
+      <w:rFonts w:ascii="Calibri" w:hAnsi="Calibri" w:eastAsia="Calibri" w:cs="Calibri"/>
       <w:iCs/>
       <w:color w:val="000000"/>
       <w:sz w:val="24"/>
       <w:szCs w:val="24"/>
     </w:rPr>
   </w:style>
-  <w:style w:styleId="Heading6" w:type="paragraph">
+  <w:style w:type="paragraph" w:styleId="Heading6">
     <w:name w:val="Heading 6"/>
     <w:basedOn w:val="Normal"/>
     <w:next w:val="BodyText"/>
@@ -10828,17 +10930,17 @@
     <w:pPr>
       <w:keepNext/>
       <w:keepLines/>
-      <w:spacing w:after="0" w:before="200"/>
+      <w:spacing w:before="200" w:after="0"/>
       <w:outlineLvl w:val="5"/>
     </w:pPr>
     <w:rPr>
-      <w:rFonts w:ascii="Calibri" w:cs="Calibri" w:eastAsia="Calibri" w:hAnsi="Calibri"/>
+      <w:rFonts w:ascii="Calibri" w:hAnsi="Calibri" w:eastAsia="Calibri" w:cs="Calibri"/>
       <w:color w:val="000000"/>
       <w:sz w:val="24"/>
       <w:szCs w:val="24"/>
     </w:rPr>
   </w:style>
-  <w:style w:styleId="Heading7" w:type="paragraph">
+  <w:style w:type="paragraph" w:styleId="Heading7">
     <w:name w:val="Heading 7"/>
     <w:basedOn w:val="Normal"/>
     <w:next w:val="BodyText"/>
@@ -10848,17 +10950,17 @@
     <w:pPr>
       <w:keepNext/>
       <w:keepLines/>
-      <w:spacing w:after="0" w:before="200"/>
+      <w:spacing w:before="200" w:after="0"/>
       <w:outlineLvl w:val="6"/>
     </w:pPr>
     <w:rPr>
-      <w:rFonts w:ascii="Calibri" w:cs="Calibri" w:eastAsia="Calibri" w:hAnsi="Calibri"/>
+      <w:rFonts w:ascii="Calibri" w:hAnsi="Calibri" w:eastAsia="Calibri" w:cs="Calibri"/>
       <w:color w:val="000000"/>
       <w:sz w:val="24"/>
       <w:szCs w:val="24"/>
     </w:rPr>
   </w:style>
-  <w:style w:styleId="Heading8" w:type="paragraph">
+  <w:style w:type="paragraph" w:styleId="Heading8">
     <w:name w:val="Heading 8"/>
     <w:basedOn w:val="Normal"/>
     <w:next w:val="BodyText"/>
@@ -10868,17 +10970,17 @@
     <w:pPr>
       <w:keepNext/>
       <w:keepLines/>
-      <w:spacing w:after="0" w:before="200"/>
+      <w:spacing w:before="200" w:after="0"/>
       <w:outlineLvl w:val="7"/>
     </w:pPr>
     <w:rPr>
-      <w:rFonts w:ascii="Calibri" w:cs="Calibri" w:eastAsia="Calibri" w:hAnsi="Calibri"/>
+      <w:rFonts w:ascii="Calibri" w:hAnsi="Calibri" w:eastAsia="Calibri" w:cs="Calibri"/>
       <w:color w:val="000000"/>
       <w:sz w:val="24"/>
       <w:szCs w:val="24"/>
     </w:rPr>
   </w:style>
-  <w:style w:styleId="Heading9" w:type="paragraph">
+  <w:style w:type="paragraph" w:styleId="Heading9">
     <w:name w:val="Heading 9"/>
     <w:basedOn w:val="Normal"/>
     <w:next w:val="BodyText"/>
@@ -10888,17 +10990,17 @@
     <w:pPr>
       <w:keepNext/>
       <w:keepLines/>
-      <w:spacing w:after="0" w:before="200"/>
+      <w:spacing w:before="200" w:after="0"/>
       <w:outlineLvl w:val="8"/>
     </w:pPr>
     <w:rPr>
-      <w:rFonts w:ascii="Calibri" w:cs="Calibri" w:eastAsia="Calibri" w:hAnsi="Calibri"/>
+      <w:rFonts w:ascii="Calibri" w:hAnsi="Calibri" w:eastAsia="Calibri" w:cs="Calibri"/>
       <w:color w:val="000000"/>
       <w:sz w:val="24"/>
       <w:szCs w:val="24"/>
     </w:rPr>
   </w:style>
-  <w:style w:styleId="BlockText" w:type="paragraph">
+  <w:style w:type="paragraph" w:styleId="BlockText">
     <w:name w:val="Block Text"/>
     <w:basedOn w:val="BodyText"/>
     <w:next w:val="BodyText"/>
@@ -10906,11 +11008,11 @@
     <w:unhideWhenUsed/>
     <w:qFormat/>
     <w:pPr>
-      <w:spacing w:after="100" w:before="100"/>
+      <w:spacing w:before="100" w:after="100"/>
       <w:ind w:firstLine="0" w:left="480" w:right="480"/>
     </w:pPr>
   </w:style>
-  <w:style w:styleId="FootnoteText" w:type="paragraph">
+  <w:style w:type="paragraph" w:styleId="FootnoteText">
     <w:name w:val="Footnote Text"/>
     <w:basedOn w:val="Normal"/>
     <w:next w:val="FootnoteText"/>
@@ -10918,30 +11020,30 @@
     <w:unhideWhenUsed/>
     <w:qFormat/>
   </w:style>
-  <w:style w:default="1" w:styleId="DefaultParagraphFont" w:type="character">
+  <w:style w:type="character" w:default="1" w:styleId="DefaultParagraphFont">
     <w:name w:val="Default Paragraph Font"/>
     <w:semiHidden/>
     <w:unhideWhenUsed/>
   </w:style>
-  <w:style w:default="1" w:styleId="Table" w:type="table">
+  <w:style w:type="table" w:default="1" w:styleId="Table">
     <w:name w:val="Table"/>
     <w:basedOn w:val="TableNormal"/>
     <w:semiHidden/>
     <w:unhideWhenUsed/>
     <w:qFormat/>
     <w:tblPr>
-      <w:tblInd w:type="dxa" w:w="0"/>
+      <w:tblInd w:w="0" w:type="dxa"/>
       <w:tblBorders>
-        <w:top w:color="808080" w:space="0" w:sz="4" w:val="single"/>
-        <w:left w:color="808080" w:space="0" w:sz="4" w:val="single"/>
-        <w:bottom w:color="808080" w:space="0" w:sz="4" w:val="single"/>
-        <w:right w:color="808080" w:space="0" w:sz="4" w:val="single"/>
-        <w:insideH w:color="808080" w:space="0" w:sz="4" w:val="single"/>
-        <w:insideV w:color="808080" w:space="0" w:sz="4" w:val="single"/>
+        <w:top w:val="single" w:sz="4" w:space="0" w:color="808080"/>
+        <w:left w:val="single" w:sz="4" w:space="0" w:color="808080"/>
+        <w:bottom w:val="single" w:sz="4" w:space="0" w:color="808080"/>
+        <w:right w:val="single" w:sz="4" w:space="0" w:color="808080"/>
+        <w:insideH w:val="single" w:sz="4" w:space="0" w:color="808080"/>
+        <w:insideV w:val="single" w:sz="4" w:space="0" w:color="808080"/>
       </w:tblBorders>
       <w:tblCellMar>
-        <w:left w:type="dxa" w:w="80"/>
-        <w:right w:type="dxa" w:w="80"/>
+        <w:left w:w="80" w:type="dxa"/>
+        <w:right w:w="80" w:type="dxa"/>
       </w:tblCellMar>
     </w:tblPr>
     <w:tblStylePr w:type="firstRow">
@@ -10949,11 +11051,11 @@
         <w:b/>
       </w:rPr>
       <w:tcPr>
-        <w:shd w:color="auto" w:fill="EDEDED" w:val="clear"/>
+        <w:shd w:val="clear" w:color="auto" w:fill="EDEDED"/>
       </w:tcPr>
     </w:tblStylePr>
   </w:style>
-  <w:style w:customStyle="1" w:styleId="DefinitionTerm" w:type="paragraph">
+  <w:style w:type="paragraph" w:customStyle="1" w:styleId="DefinitionTerm">
     <w:name w:val="Definition Term"/>
     <w:basedOn w:val="Normal"/>
     <w:next w:val="Definition"/>
@@ -10966,75 +11068,75 @@
       <w:b/>
     </w:rPr>
   </w:style>
-  <w:style w:customStyle="1" w:styleId="Definition" w:type="paragraph">
+  <w:style w:type="paragraph" w:customStyle="1" w:styleId="Definition">
     <w:name w:val="Definition"/>
     <w:basedOn w:val="Normal"/>
   </w:style>
-  <w:style w:styleId="Caption" w:type="paragraph">
+  <w:style w:type="paragraph" w:styleId="Caption">
     <w:name w:val="Caption"/>
     <w:basedOn w:val="Normal"/>
     <w:link w:val="BodyTextChar"/>
     <w:pPr>
-      <w:spacing w:after="120" w:before="0"/>
+      <w:spacing w:before="0" w:after="120"/>
     </w:pPr>
     <w:rPr>
       <w:i/>
     </w:rPr>
   </w:style>
-  <w:style w:customStyle="1" w:styleId="TableCaption" w:type="paragraph">
+  <w:style w:type="paragraph" w:customStyle="1" w:styleId="TableCaption">
     <w:name w:val="Table Caption"/>
     <w:basedOn w:val="Caption"/>
     <w:pPr>
       <w:keepNext/>
     </w:pPr>
   </w:style>
-  <w:style w:customStyle="1" w:styleId="ImageCaption" w:type="paragraph">
+  <w:style w:type="paragraph" w:customStyle="1" w:styleId="ImageCaption">
     <w:name w:val="Image Caption"/>
     <w:basedOn w:val="Caption"/>
   </w:style>
-  <w:style w:customStyle="1" w:styleId="Figure" w:type="paragraph">
+  <w:style w:type="paragraph" w:customStyle="1" w:styleId="Figure">
     <w:name w:val="Figure"/>
     <w:basedOn w:val="Normal"/>
   </w:style>
-  <w:style w:customStyle="1" w:styleId="CaptionedFigure" w:type="paragraph">
+  <w:style w:type="paragraph" w:customStyle="1" w:styleId="CaptionedFigure">
     <w:name w:val="Captioned Figure"/>
     <w:basedOn w:val="Figure"/>
     <w:pPr>
       <w:keepNext/>
     </w:pPr>
   </w:style>
-  <w:style w:customStyle="1" w:styleId="BodyTextChar" w:type="character">
+  <w:style w:type="character" w:customStyle="1" w:styleId="BodyTextChar">
     <w:name w:val="Body Text Char"/>
     <w:basedOn w:val="DefaultParagraphFont"/>
     <w:link w:val="BodyText"/>
   </w:style>
-  <w:style w:customStyle="1" w:styleId="VerbatimChar" w:type="character">
+  <w:style w:type="character" w:customStyle="1" w:styleId="VerbatimChar">
     <w:name w:val="Verbatim Char"/>
     <w:basedOn w:val="BodyTextChar"/>
     <w:rPr>
-      <w:rFonts w:ascii="Consolas" w:cs="Consolas" w:eastAsia="Consolas" w:hAnsi="Consolas"/>
+      <w:rFonts w:ascii="Consolas" w:hAnsi="Consolas" w:eastAsia="Consolas" w:cs="Consolas"/>
       <w:sz w:val="22"/>
     </w:rPr>
   </w:style>
-  <w:style w:customStyle="1" w:styleId="SectionNumber" w:type="character">
+  <w:style w:type="character" w:customStyle="1" w:styleId="SectionNumber">
     <w:name w:val="Section Number"/>
     <w:basedOn w:val="BodyTextChar"/>
   </w:style>
-  <w:style w:styleId="FootnoteReference" w:type="character">
+  <w:style w:type="character" w:styleId="FootnoteReference">
     <w:name w:val="Footnote Reference"/>
     <w:basedOn w:val="BodyTextChar"/>
     <w:rPr>
       <w:vertAlign w:val="superscript"/>
     </w:rPr>
   </w:style>
-  <w:style w:styleId="Hyperlink" w:type="character">
+  <w:style w:type="character" w:styleId="Hyperlink">
     <w:name w:val="Hyperlink"/>
     <w:basedOn w:val="BodyTextChar"/>
     <w:rPr>
       <w:color w:val="000000"/>
     </w:rPr>
   </w:style>
-  <w:style w:styleId="TOCHeading" w:type="paragraph">
+  <w:style w:type="paragraph" w:styleId="TOCHeading">
     <w:name w:val="TOC Heading"/>
     <w:basedOn w:val="Heading1"/>
     <w:next w:val="BodyText"/>
@@ -11046,7 +11148,7 @@
       <w:outlineLvl w:val="9"/>
     </w:pPr>
     <w:rPr>
-      <w:rFonts w:ascii="Calibri" w:cs="Calibri" w:eastAsia="Calibri" w:hAnsi="Calibri"/>
+      <w:rFonts w:ascii="Calibri" w:hAnsi="Calibri" w:eastAsia="Calibri" w:cs="Calibri"/>
       <w:b w:val="0"/>
       <w:bCs w:val="0"/>
       <w:color w:val="000000"/>

</xml_diff>